<commit_message>
Updated Table 4 Correlation Matrix Rafaela
</commit_message>
<xml_diff>
--- a/Table_4_Correlation_Matrix.docx
+++ b/Table_4_Correlation_Matrix.docx
@@ -17,7 +17,13 @@
         <w:tblLook w:firstRow="1" w:lastRow="0" w:firstColumn="0" w:lastColumn="0" w:noHBand="0" w:noVBand="1"/>
       </w:tblPr>
       <w:tblGrid>
-        <w:gridCol w:w="1218"/>
+        <w:gridCol w:w="1671"/>
+        <w:gridCol w:w="1034"/>
+        <w:gridCol w:w="1034"/>
+        <w:gridCol w:w="1034"/>
+        <w:gridCol w:w="1034"/>
+        <w:gridCol w:w="1034"/>
+        <w:gridCol w:w="533"/>
       </w:tblGrid>
       <w:tr>
         <w:trPr>
@@ -75,7 +81,2677 @@
                 <w:szCs w:val="22"/>
                 <w:color w:val="000000"/>
               </w:rPr>
-              <w:t xml:space="preserve">Variable</w:t>
+              <w:t xml:space="preserve">term</w:t>
+            </w:r>
+          </w:p>
+        </w:tc>
+        <w:tc>
+          <w:tcPr>
+            <w:tcBorders>
+              <w:bottom w:val="single" w:sz="12" w:space="0" w:color="666666"/>
+              <w:top w:val="single" w:sz="12" w:space="0" w:color="666666"/>
+              <w:left w:val="none" w:sz="0" w:space="0" w:color="000000"/>
+              <w:right w:val="none" w:sz="0" w:space="0" w:color="000000"/>
+            </w:tcBorders>
+            <w:shd w:val="clear" w:color="auto" w:fill="FFFFFF"/>
+            <w:tcMar>
+              <w:top w:w="0" w:type="dxa"/>
+              <w:bottom w:w="0" w:type="dxa"/>
+              <w:left w:w="0" w:type="dxa"/>
+              <w:right w:w="0" w:type="dxa"/>
+            </w:tcMar>
+            <w:vAlign w:val="center"/>
+          </w:tcPr>
+          <w:p>
+            <w:pPr>
+              <w:pStyle w:val="Normal"/>
+              <w:jc w:val="left"/>
+              <w:pBdr>
+                <w:bottom w:val="none" w:sz="0" w:space="0" w:color="000000"/>
+                <w:top w:val="none" w:sz="0" w:space="0" w:color="000000"/>
+                <w:left w:val="none" w:sz="0" w:space="0" w:color="000000"/>
+                <w:right w:val="none" w:sz="0" w:space="0" w:color="000000"/>
+              </w:pBdr>
+              <w:spacing w:after="100" w:before="100" w:line="240"/>
+              <w:ind w:left="100" w:right="100" w:firstLine="0" w:firstLineChars="0"/>
+              <w:rPr>
+                <w:rFonts w:ascii="Helvetica" w:hAnsi="Helvetica" w:eastAsia="Helvetica" w:cs="Helvetica"/>
+                <w:i w:val="false"/>
+                <w:b w:val="false"/>
+                <w:u w:val="none"/>
+                <w:strike w:val="false"/>
+                <w:sz w:val="22"/>
+                <w:szCs w:val="22"/>
+                <w:color w:val="000000"/>
+              </w:rPr>
+            </w:pPr>
+            <w:r>
+              <w:rPr>
+                <w:rFonts w:ascii="Helvetica" w:hAnsi="Helvetica" w:eastAsia="Helvetica" w:cs="Helvetica"/>
+                <w:i w:val="false"/>
+                <w:b w:val="false"/>
+                <w:u w:val="none"/>
+                <w:strike w:val="false"/>
+                <w:sz w:val="22"/>
+                <w:szCs w:val="22"/>
+                <w:color w:val="000000"/>
+              </w:rPr>
+              <w:t xml:space="preserve">1</w:t>
+            </w:r>
+          </w:p>
+        </w:tc>
+        <w:tc>
+          <w:tcPr>
+            <w:tcBorders>
+              <w:bottom w:val="single" w:sz="12" w:space="0" w:color="666666"/>
+              <w:top w:val="single" w:sz="12" w:space="0" w:color="666666"/>
+              <w:left w:val="none" w:sz="0" w:space="0" w:color="000000"/>
+              <w:right w:val="none" w:sz="0" w:space="0" w:color="000000"/>
+            </w:tcBorders>
+            <w:shd w:val="clear" w:color="auto" w:fill="FFFFFF"/>
+            <w:tcMar>
+              <w:top w:w="0" w:type="dxa"/>
+              <w:bottom w:w="0" w:type="dxa"/>
+              <w:left w:w="0" w:type="dxa"/>
+              <w:right w:w="0" w:type="dxa"/>
+            </w:tcMar>
+            <w:vAlign w:val="center"/>
+          </w:tcPr>
+          <w:p>
+            <w:pPr>
+              <w:pStyle w:val="Normal"/>
+              <w:jc w:val="left"/>
+              <w:pBdr>
+                <w:bottom w:val="none" w:sz="0" w:space="0" w:color="000000"/>
+                <w:top w:val="none" w:sz="0" w:space="0" w:color="000000"/>
+                <w:left w:val="none" w:sz="0" w:space="0" w:color="000000"/>
+                <w:right w:val="none" w:sz="0" w:space="0" w:color="000000"/>
+              </w:pBdr>
+              <w:spacing w:after="100" w:before="100" w:line="240"/>
+              <w:ind w:left="100" w:right="100" w:firstLine="0" w:firstLineChars="0"/>
+              <w:rPr>
+                <w:rFonts w:ascii="Helvetica" w:hAnsi="Helvetica" w:eastAsia="Helvetica" w:cs="Helvetica"/>
+                <w:i w:val="false"/>
+                <w:b w:val="false"/>
+                <w:u w:val="none"/>
+                <w:strike w:val="false"/>
+                <w:sz w:val="22"/>
+                <w:szCs w:val="22"/>
+                <w:color w:val="000000"/>
+              </w:rPr>
+            </w:pPr>
+            <w:r>
+              <w:rPr>
+                <w:rFonts w:ascii="Helvetica" w:hAnsi="Helvetica" w:eastAsia="Helvetica" w:cs="Helvetica"/>
+                <w:i w:val="false"/>
+                <w:b w:val="false"/>
+                <w:u w:val="none"/>
+                <w:strike w:val="false"/>
+                <w:sz w:val="22"/>
+                <w:szCs w:val="22"/>
+                <w:color w:val="000000"/>
+              </w:rPr>
+              <w:t xml:space="preserve">2</w:t>
+            </w:r>
+          </w:p>
+        </w:tc>
+        <w:tc>
+          <w:tcPr>
+            <w:tcBorders>
+              <w:bottom w:val="single" w:sz="12" w:space="0" w:color="666666"/>
+              <w:top w:val="single" w:sz="12" w:space="0" w:color="666666"/>
+              <w:left w:val="none" w:sz="0" w:space="0" w:color="000000"/>
+              <w:right w:val="none" w:sz="0" w:space="0" w:color="000000"/>
+            </w:tcBorders>
+            <w:shd w:val="clear" w:color="auto" w:fill="FFFFFF"/>
+            <w:tcMar>
+              <w:top w:w="0" w:type="dxa"/>
+              <w:bottom w:w="0" w:type="dxa"/>
+              <w:left w:w="0" w:type="dxa"/>
+              <w:right w:w="0" w:type="dxa"/>
+            </w:tcMar>
+            <w:vAlign w:val="center"/>
+          </w:tcPr>
+          <w:p>
+            <w:pPr>
+              <w:pStyle w:val="Normal"/>
+              <w:jc w:val="left"/>
+              <w:pBdr>
+                <w:bottom w:val="none" w:sz="0" w:space="0" w:color="000000"/>
+                <w:top w:val="none" w:sz="0" w:space="0" w:color="000000"/>
+                <w:left w:val="none" w:sz="0" w:space="0" w:color="000000"/>
+                <w:right w:val="none" w:sz="0" w:space="0" w:color="000000"/>
+              </w:pBdr>
+              <w:spacing w:after="100" w:before="100" w:line="240"/>
+              <w:ind w:left="100" w:right="100" w:firstLine="0" w:firstLineChars="0"/>
+              <w:rPr>
+                <w:rFonts w:ascii="Helvetica" w:hAnsi="Helvetica" w:eastAsia="Helvetica" w:cs="Helvetica"/>
+                <w:i w:val="false"/>
+                <w:b w:val="false"/>
+                <w:u w:val="none"/>
+                <w:strike w:val="false"/>
+                <w:sz w:val="22"/>
+                <w:szCs w:val="22"/>
+                <w:color w:val="000000"/>
+              </w:rPr>
+            </w:pPr>
+            <w:r>
+              <w:rPr>
+                <w:rFonts w:ascii="Helvetica" w:hAnsi="Helvetica" w:eastAsia="Helvetica" w:cs="Helvetica"/>
+                <w:i w:val="false"/>
+                <w:b w:val="false"/>
+                <w:u w:val="none"/>
+                <w:strike w:val="false"/>
+                <w:sz w:val="22"/>
+                <w:szCs w:val="22"/>
+                <w:color w:val="000000"/>
+              </w:rPr>
+              <w:t xml:space="preserve">3</w:t>
+            </w:r>
+          </w:p>
+        </w:tc>
+        <w:tc>
+          <w:tcPr>
+            <w:tcBorders>
+              <w:bottom w:val="single" w:sz="12" w:space="0" w:color="666666"/>
+              <w:top w:val="single" w:sz="12" w:space="0" w:color="666666"/>
+              <w:left w:val="none" w:sz="0" w:space="0" w:color="000000"/>
+              <w:right w:val="none" w:sz="0" w:space="0" w:color="000000"/>
+            </w:tcBorders>
+            <w:shd w:val="clear" w:color="auto" w:fill="FFFFFF"/>
+            <w:tcMar>
+              <w:top w:w="0" w:type="dxa"/>
+              <w:bottom w:w="0" w:type="dxa"/>
+              <w:left w:w="0" w:type="dxa"/>
+              <w:right w:w="0" w:type="dxa"/>
+            </w:tcMar>
+            <w:vAlign w:val="center"/>
+          </w:tcPr>
+          <w:p>
+            <w:pPr>
+              <w:pStyle w:val="Normal"/>
+              <w:jc w:val="left"/>
+              <w:pBdr>
+                <w:bottom w:val="none" w:sz="0" w:space="0" w:color="000000"/>
+                <w:top w:val="none" w:sz="0" w:space="0" w:color="000000"/>
+                <w:left w:val="none" w:sz="0" w:space="0" w:color="000000"/>
+                <w:right w:val="none" w:sz="0" w:space="0" w:color="000000"/>
+              </w:pBdr>
+              <w:spacing w:after="100" w:before="100" w:line="240"/>
+              <w:ind w:left="100" w:right="100" w:firstLine="0" w:firstLineChars="0"/>
+              <w:rPr>
+                <w:rFonts w:ascii="Helvetica" w:hAnsi="Helvetica" w:eastAsia="Helvetica" w:cs="Helvetica"/>
+                <w:i w:val="false"/>
+                <w:b w:val="false"/>
+                <w:u w:val="none"/>
+                <w:strike w:val="false"/>
+                <w:sz w:val="22"/>
+                <w:szCs w:val="22"/>
+                <w:color w:val="000000"/>
+              </w:rPr>
+            </w:pPr>
+            <w:r>
+              <w:rPr>
+                <w:rFonts w:ascii="Helvetica" w:hAnsi="Helvetica" w:eastAsia="Helvetica" w:cs="Helvetica"/>
+                <w:i w:val="false"/>
+                <w:b w:val="false"/>
+                <w:u w:val="none"/>
+                <w:strike w:val="false"/>
+                <w:sz w:val="22"/>
+                <w:szCs w:val="22"/>
+                <w:color w:val="000000"/>
+              </w:rPr>
+              <w:t xml:space="preserve">4</w:t>
+            </w:r>
+          </w:p>
+        </w:tc>
+        <w:tc>
+          <w:tcPr>
+            <w:tcBorders>
+              <w:bottom w:val="single" w:sz="12" w:space="0" w:color="666666"/>
+              <w:top w:val="single" w:sz="12" w:space="0" w:color="666666"/>
+              <w:left w:val="none" w:sz="0" w:space="0" w:color="000000"/>
+              <w:right w:val="none" w:sz="0" w:space="0" w:color="000000"/>
+            </w:tcBorders>
+            <w:shd w:val="clear" w:color="auto" w:fill="FFFFFF"/>
+            <w:tcMar>
+              <w:top w:w="0" w:type="dxa"/>
+              <w:bottom w:w="0" w:type="dxa"/>
+              <w:left w:w="0" w:type="dxa"/>
+              <w:right w:w="0" w:type="dxa"/>
+            </w:tcMar>
+            <w:vAlign w:val="center"/>
+          </w:tcPr>
+          <w:p>
+            <w:pPr>
+              <w:pStyle w:val="Normal"/>
+              <w:jc w:val="left"/>
+              <w:pBdr>
+                <w:bottom w:val="none" w:sz="0" w:space="0" w:color="000000"/>
+                <w:top w:val="none" w:sz="0" w:space="0" w:color="000000"/>
+                <w:left w:val="none" w:sz="0" w:space="0" w:color="000000"/>
+                <w:right w:val="none" w:sz="0" w:space="0" w:color="000000"/>
+              </w:pBdr>
+              <w:spacing w:after="100" w:before="100" w:line="240"/>
+              <w:ind w:left="100" w:right="100" w:firstLine="0" w:firstLineChars="0"/>
+              <w:rPr>
+                <w:rFonts w:ascii="Helvetica" w:hAnsi="Helvetica" w:eastAsia="Helvetica" w:cs="Helvetica"/>
+                <w:i w:val="false"/>
+                <w:b w:val="false"/>
+                <w:u w:val="none"/>
+                <w:strike w:val="false"/>
+                <w:sz w:val="22"/>
+                <w:szCs w:val="22"/>
+                <w:color w:val="000000"/>
+              </w:rPr>
+            </w:pPr>
+            <w:r>
+              <w:rPr>
+                <w:rFonts w:ascii="Helvetica" w:hAnsi="Helvetica" w:eastAsia="Helvetica" w:cs="Helvetica"/>
+                <w:i w:val="false"/>
+                <w:b w:val="false"/>
+                <w:u w:val="none"/>
+                <w:strike w:val="false"/>
+                <w:sz w:val="22"/>
+                <w:szCs w:val="22"/>
+                <w:color w:val="000000"/>
+              </w:rPr>
+              <w:t xml:space="preserve">5</w:t>
+            </w:r>
+          </w:p>
+        </w:tc>
+        <w:tc>
+          <w:tcPr>
+            <w:tcBorders>
+              <w:bottom w:val="single" w:sz="12" w:space="0" w:color="666666"/>
+              <w:top w:val="single" w:sz="12" w:space="0" w:color="666666"/>
+              <w:left w:val="none" w:sz="0" w:space="0" w:color="000000"/>
+              <w:right w:val="none" w:sz="0" w:space="0" w:color="000000"/>
+            </w:tcBorders>
+            <w:shd w:val="clear" w:color="auto" w:fill="FFFFFF"/>
+            <w:tcMar>
+              <w:top w:w="0" w:type="dxa"/>
+              <w:bottom w:w="0" w:type="dxa"/>
+              <w:left w:w="0" w:type="dxa"/>
+              <w:right w:w="0" w:type="dxa"/>
+            </w:tcMar>
+            <w:vAlign w:val="center"/>
+          </w:tcPr>
+          <w:p>
+            <w:pPr>
+              <w:pStyle w:val="Normal"/>
+              <w:jc w:val="left"/>
+              <w:pBdr>
+                <w:bottom w:val="none" w:sz="0" w:space="0" w:color="000000"/>
+                <w:top w:val="none" w:sz="0" w:space="0" w:color="000000"/>
+                <w:left w:val="none" w:sz="0" w:space="0" w:color="000000"/>
+                <w:right w:val="none" w:sz="0" w:space="0" w:color="000000"/>
+              </w:pBdr>
+              <w:spacing w:after="100" w:before="100" w:line="240"/>
+              <w:ind w:left="100" w:right="100" w:firstLine="0" w:firstLineChars="0"/>
+              <w:rPr>
+                <w:rFonts w:ascii="Helvetica" w:hAnsi="Helvetica" w:eastAsia="Helvetica" w:cs="Helvetica"/>
+                <w:i w:val="false"/>
+                <w:b w:val="false"/>
+                <w:u w:val="none"/>
+                <w:strike w:val="false"/>
+                <w:sz w:val="22"/>
+                <w:szCs w:val="22"/>
+                <w:color w:val="000000"/>
+              </w:rPr>
+            </w:pPr>
+            <w:r>
+              <w:rPr>
+                <w:rFonts w:ascii="Helvetica" w:hAnsi="Helvetica" w:eastAsia="Helvetica" w:cs="Helvetica"/>
+                <w:i w:val="false"/>
+                <w:b w:val="false"/>
+                <w:u w:val="none"/>
+                <w:strike w:val="false"/>
+                <w:sz w:val="22"/>
+                <w:szCs w:val="22"/>
+                <w:color w:val="000000"/>
+              </w:rPr>
+              <w:t xml:space="preserve">6</w:t>
+            </w:r>
+          </w:p>
+        </w:tc>
+      </w:tr>
+      <w:tr>
+        <w:trPr>
+          <w:trHeight w:val="608" w:hRule="auto"/>
+        </w:trPr>
+        <w:tc>
+          <w:tcPr>
+            <w:tcBorders>
+              <w:bottom w:val="none" w:sz="0" w:space="0" w:color="000000"/>
+              <w:top w:val="single" w:sz="12" w:space="0" w:color="666666"/>
+              <w:left w:val="none" w:sz="0" w:space="0" w:color="000000"/>
+              <w:right w:val="none" w:sz="0" w:space="0" w:color="000000"/>
+            </w:tcBorders>
+            <w:shd w:val="clear" w:color="auto" w:fill="FFFFFF"/>
+            <w:tcMar>
+              <w:top w:w="0" w:type="dxa"/>
+              <w:bottom w:w="0" w:type="dxa"/>
+              <w:left w:w="0" w:type="dxa"/>
+              <w:right w:w="0" w:type="dxa"/>
+            </w:tcMar>
+            <w:vAlign w:val="center"/>
+          </w:tcPr>
+          <w:p>
+            <w:pPr>
+              <w:pStyle w:val="Normal"/>
+              <w:jc w:val="left"/>
+              <w:pBdr>
+                <w:bottom w:val="none" w:sz="0" w:space="0" w:color="000000"/>
+                <w:top w:val="none" w:sz="0" w:space="0" w:color="000000"/>
+                <w:left w:val="none" w:sz="0" w:space="0" w:color="000000"/>
+                <w:right w:val="none" w:sz="0" w:space="0" w:color="000000"/>
+              </w:pBdr>
+              <w:spacing w:after="100" w:before="100" w:line="240"/>
+              <w:ind w:left="100" w:right="100" w:firstLine="0" w:firstLineChars="0"/>
+              <w:rPr>
+                <w:rFonts w:ascii="Helvetica" w:hAnsi="Helvetica" w:eastAsia="Helvetica" w:cs="Helvetica"/>
+                <w:i w:val="false"/>
+                <w:b w:val="false"/>
+                <w:u w:val="none"/>
+                <w:strike w:val="false"/>
+                <w:sz w:val="22"/>
+                <w:szCs w:val="22"/>
+                <w:color w:val="000000"/>
+              </w:rPr>
+            </w:pPr>
+            <w:r>
+              <w:rPr>
+                <w:rFonts w:ascii="Helvetica" w:hAnsi="Helvetica" w:eastAsia="Helvetica" w:cs="Helvetica"/>
+                <w:i w:val="false"/>
+                <w:b w:val="false"/>
+                <w:u w:val="none"/>
+                <w:strike w:val="false"/>
+                <w:sz w:val="22"/>
+                <w:szCs w:val="22"/>
+                <w:color w:val="000000"/>
+              </w:rPr>
+              <w:t xml:space="preserve">age</w:t>
+            </w:r>
+          </w:p>
+        </w:tc>
+        <w:tc>
+          <w:tcPr>
+            <w:tcBorders>
+              <w:bottom w:val="none" w:sz="0" w:space="0" w:color="000000"/>
+              <w:top w:val="single" w:sz="12" w:space="0" w:color="666666"/>
+              <w:left w:val="none" w:sz="0" w:space="0" w:color="000000"/>
+              <w:right w:val="none" w:sz="0" w:space="0" w:color="000000"/>
+            </w:tcBorders>
+            <w:shd w:val="clear" w:color="auto" w:fill="FFFFFF"/>
+            <w:tcMar>
+              <w:top w:w="0" w:type="dxa"/>
+              <w:bottom w:w="0" w:type="dxa"/>
+              <w:left w:w="0" w:type="dxa"/>
+              <w:right w:w="0" w:type="dxa"/>
+            </w:tcMar>
+            <w:vAlign w:val="center"/>
+          </w:tcPr>
+          <w:p>
+            <w:pPr>
+              <w:pStyle w:val="Normal"/>
+              <w:jc w:val="left"/>
+              <w:pBdr>
+                <w:bottom w:val="none" w:sz="0" w:space="0" w:color="000000"/>
+                <w:top w:val="none" w:sz="0" w:space="0" w:color="000000"/>
+                <w:left w:val="none" w:sz="0" w:space="0" w:color="000000"/>
+                <w:right w:val="none" w:sz="0" w:space="0" w:color="000000"/>
+              </w:pBdr>
+              <w:spacing w:after="100" w:before="100" w:line="240"/>
+              <w:ind w:left="100" w:right="100" w:firstLine="0" w:firstLineChars="0"/>
+              <w:rPr>
+                <w:rFonts w:ascii="Helvetica" w:hAnsi="Helvetica" w:eastAsia="Helvetica" w:cs="Helvetica"/>
+                <w:i w:val="false"/>
+                <w:b w:val="false"/>
+                <w:u w:val="none"/>
+                <w:strike w:val="false"/>
+                <w:sz w:val="22"/>
+                <w:szCs w:val="22"/>
+                <w:color w:val="000000"/>
+              </w:rPr>
+            </w:pPr>
+            <w:r>
+              <w:rPr>
+                <w:rFonts w:ascii="Helvetica" w:hAnsi="Helvetica" w:eastAsia="Helvetica" w:cs="Helvetica"/>
+                <w:i w:val="false"/>
+                <w:b w:val="false"/>
+                <w:u w:val="none"/>
+                <w:strike w:val="false"/>
+                <w:sz w:val="22"/>
+                <w:szCs w:val="22"/>
+                <w:color w:val="000000"/>
+              </w:rPr>
+              <w:t xml:space="preserve"/>
+            </w:r>
+          </w:p>
+        </w:tc>
+        <w:tc>
+          <w:tcPr>
+            <w:tcBorders>
+              <w:bottom w:val="none" w:sz="0" w:space="0" w:color="000000"/>
+              <w:top w:val="single" w:sz="12" w:space="0" w:color="666666"/>
+              <w:left w:val="none" w:sz="0" w:space="0" w:color="000000"/>
+              <w:right w:val="none" w:sz="0" w:space="0" w:color="000000"/>
+            </w:tcBorders>
+            <w:shd w:val="clear" w:color="auto" w:fill="FFFFFF"/>
+            <w:tcMar>
+              <w:top w:w="0" w:type="dxa"/>
+              <w:bottom w:w="0" w:type="dxa"/>
+              <w:left w:w="0" w:type="dxa"/>
+              <w:right w:w="0" w:type="dxa"/>
+            </w:tcMar>
+            <w:vAlign w:val="center"/>
+          </w:tcPr>
+          <w:p>
+            <w:pPr>
+              <w:pStyle w:val="Normal"/>
+              <w:jc w:val="left"/>
+              <w:pBdr>
+                <w:bottom w:val="none" w:sz="0" w:space="0" w:color="000000"/>
+                <w:top w:val="none" w:sz="0" w:space="0" w:color="000000"/>
+                <w:left w:val="none" w:sz="0" w:space="0" w:color="000000"/>
+                <w:right w:val="none" w:sz="0" w:space="0" w:color="000000"/>
+              </w:pBdr>
+              <w:spacing w:after="100" w:before="100" w:line="240"/>
+              <w:ind w:left="100" w:right="100" w:firstLine="0" w:firstLineChars="0"/>
+              <w:rPr>
+                <w:rFonts w:ascii="Helvetica" w:hAnsi="Helvetica" w:eastAsia="Helvetica" w:cs="Helvetica"/>
+                <w:i w:val="false"/>
+                <w:b w:val="false"/>
+                <w:u w:val="none"/>
+                <w:strike w:val="false"/>
+                <w:sz w:val="22"/>
+                <w:szCs w:val="22"/>
+                <w:color w:val="000000"/>
+              </w:rPr>
+            </w:pPr>
+            <w:r>
+              <w:rPr>
+                <w:rFonts w:ascii="Helvetica" w:hAnsi="Helvetica" w:eastAsia="Helvetica" w:cs="Helvetica"/>
+                <w:i w:val="false"/>
+                <w:b w:val="false"/>
+                <w:u w:val="none"/>
+                <w:strike w:val="false"/>
+                <w:sz w:val="22"/>
+                <w:szCs w:val="22"/>
+                <w:color w:val="000000"/>
+              </w:rPr>
+              <w:t xml:space="preserve"/>
+            </w:r>
+          </w:p>
+        </w:tc>
+        <w:tc>
+          <w:tcPr>
+            <w:tcBorders>
+              <w:bottom w:val="none" w:sz="0" w:space="0" w:color="000000"/>
+              <w:top w:val="single" w:sz="12" w:space="0" w:color="666666"/>
+              <w:left w:val="none" w:sz="0" w:space="0" w:color="000000"/>
+              <w:right w:val="none" w:sz="0" w:space="0" w:color="000000"/>
+            </w:tcBorders>
+            <w:shd w:val="clear" w:color="auto" w:fill="FFFFFF"/>
+            <w:tcMar>
+              <w:top w:w="0" w:type="dxa"/>
+              <w:bottom w:w="0" w:type="dxa"/>
+              <w:left w:w="0" w:type="dxa"/>
+              <w:right w:w="0" w:type="dxa"/>
+            </w:tcMar>
+            <w:vAlign w:val="center"/>
+          </w:tcPr>
+          <w:p>
+            <w:pPr>
+              <w:pStyle w:val="Normal"/>
+              <w:jc w:val="left"/>
+              <w:pBdr>
+                <w:bottom w:val="none" w:sz="0" w:space="0" w:color="000000"/>
+                <w:top w:val="none" w:sz="0" w:space="0" w:color="000000"/>
+                <w:left w:val="none" w:sz="0" w:space="0" w:color="000000"/>
+                <w:right w:val="none" w:sz="0" w:space="0" w:color="000000"/>
+              </w:pBdr>
+              <w:spacing w:after="100" w:before="100" w:line="240"/>
+              <w:ind w:left="100" w:right="100" w:firstLine="0" w:firstLineChars="0"/>
+              <w:rPr>
+                <w:rFonts w:ascii="Helvetica" w:hAnsi="Helvetica" w:eastAsia="Helvetica" w:cs="Helvetica"/>
+                <w:i w:val="false"/>
+                <w:b w:val="false"/>
+                <w:u w:val="none"/>
+                <w:strike w:val="false"/>
+                <w:sz w:val="22"/>
+                <w:szCs w:val="22"/>
+                <w:color w:val="000000"/>
+              </w:rPr>
+            </w:pPr>
+            <w:r>
+              <w:rPr>
+                <w:rFonts w:ascii="Helvetica" w:hAnsi="Helvetica" w:eastAsia="Helvetica" w:cs="Helvetica"/>
+                <w:i w:val="false"/>
+                <w:b w:val="false"/>
+                <w:u w:val="none"/>
+                <w:strike w:val="false"/>
+                <w:sz w:val="22"/>
+                <w:szCs w:val="22"/>
+                <w:color w:val="000000"/>
+              </w:rPr>
+              <w:t xml:space="preserve"/>
+            </w:r>
+          </w:p>
+        </w:tc>
+        <w:tc>
+          <w:tcPr>
+            <w:tcBorders>
+              <w:bottom w:val="none" w:sz="0" w:space="0" w:color="000000"/>
+              <w:top w:val="single" w:sz="12" w:space="0" w:color="666666"/>
+              <w:left w:val="none" w:sz="0" w:space="0" w:color="000000"/>
+              <w:right w:val="none" w:sz="0" w:space="0" w:color="000000"/>
+            </w:tcBorders>
+            <w:shd w:val="clear" w:color="auto" w:fill="FFFFFF"/>
+            <w:tcMar>
+              <w:top w:w="0" w:type="dxa"/>
+              <w:bottom w:w="0" w:type="dxa"/>
+              <w:left w:w="0" w:type="dxa"/>
+              <w:right w:w="0" w:type="dxa"/>
+            </w:tcMar>
+            <w:vAlign w:val="center"/>
+          </w:tcPr>
+          <w:p>
+            <w:pPr>
+              <w:pStyle w:val="Normal"/>
+              <w:jc w:val="left"/>
+              <w:pBdr>
+                <w:bottom w:val="none" w:sz="0" w:space="0" w:color="000000"/>
+                <w:top w:val="none" w:sz="0" w:space="0" w:color="000000"/>
+                <w:left w:val="none" w:sz="0" w:space="0" w:color="000000"/>
+                <w:right w:val="none" w:sz="0" w:space="0" w:color="000000"/>
+              </w:pBdr>
+              <w:spacing w:after="100" w:before="100" w:line="240"/>
+              <w:ind w:left="100" w:right="100" w:firstLine="0" w:firstLineChars="0"/>
+              <w:rPr>
+                <w:rFonts w:ascii="Helvetica" w:hAnsi="Helvetica" w:eastAsia="Helvetica" w:cs="Helvetica"/>
+                <w:i w:val="false"/>
+                <w:b w:val="false"/>
+                <w:u w:val="none"/>
+                <w:strike w:val="false"/>
+                <w:sz w:val="22"/>
+                <w:szCs w:val="22"/>
+                <w:color w:val="000000"/>
+              </w:rPr>
+            </w:pPr>
+            <w:r>
+              <w:rPr>
+                <w:rFonts w:ascii="Helvetica" w:hAnsi="Helvetica" w:eastAsia="Helvetica" w:cs="Helvetica"/>
+                <w:i w:val="false"/>
+                <w:b w:val="false"/>
+                <w:u w:val="none"/>
+                <w:strike w:val="false"/>
+                <w:sz w:val="22"/>
+                <w:szCs w:val="22"/>
+                <w:color w:val="000000"/>
+              </w:rPr>
+              <w:t xml:space="preserve"/>
+            </w:r>
+          </w:p>
+        </w:tc>
+        <w:tc>
+          <w:tcPr>
+            <w:tcBorders>
+              <w:bottom w:val="none" w:sz="0" w:space="0" w:color="000000"/>
+              <w:top w:val="single" w:sz="12" w:space="0" w:color="666666"/>
+              <w:left w:val="none" w:sz="0" w:space="0" w:color="000000"/>
+              <w:right w:val="none" w:sz="0" w:space="0" w:color="000000"/>
+            </w:tcBorders>
+            <w:shd w:val="clear" w:color="auto" w:fill="FFFFFF"/>
+            <w:tcMar>
+              <w:top w:w="0" w:type="dxa"/>
+              <w:bottom w:w="0" w:type="dxa"/>
+              <w:left w:w="0" w:type="dxa"/>
+              <w:right w:w="0" w:type="dxa"/>
+            </w:tcMar>
+            <w:vAlign w:val="center"/>
+          </w:tcPr>
+          <w:p>
+            <w:pPr>
+              <w:pStyle w:val="Normal"/>
+              <w:jc w:val="left"/>
+              <w:pBdr>
+                <w:bottom w:val="none" w:sz="0" w:space="0" w:color="000000"/>
+                <w:top w:val="none" w:sz="0" w:space="0" w:color="000000"/>
+                <w:left w:val="none" w:sz="0" w:space="0" w:color="000000"/>
+                <w:right w:val="none" w:sz="0" w:space="0" w:color="000000"/>
+              </w:pBdr>
+              <w:spacing w:after="100" w:before="100" w:line="240"/>
+              <w:ind w:left="100" w:right="100" w:firstLine="0" w:firstLineChars="0"/>
+              <w:rPr>
+                <w:rFonts w:ascii="Helvetica" w:hAnsi="Helvetica" w:eastAsia="Helvetica" w:cs="Helvetica"/>
+                <w:i w:val="false"/>
+                <w:b w:val="false"/>
+                <w:u w:val="none"/>
+                <w:strike w:val="false"/>
+                <w:sz w:val="22"/>
+                <w:szCs w:val="22"/>
+                <w:color w:val="000000"/>
+              </w:rPr>
+            </w:pPr>
+            <w:r>
+              <w:rPr>
+                <w:rFonts w:ascii="Helvetica" w:hAnsi="Helvetica" w:eastAsia="Helvetica" w:cs="Helvetica"/>
+                <w:i w:val="false"/>
+                <w:b w:val="false"/>
+                <w:u w:val="none"/>
+                <w:strike w:val="false"/>
+                <w:sz w:val="22"/>
+                <w:szCs w:val="22"/>
+                <w:color w:val="000000"/>
+              </w:rPr>
+              <w:t xml:space="preserve"/>
+            </w:r>
+          </w:p>
+        </w:tc>
+        <w:tc>
+          <w:tcPr>
+            <w:tcBorders>
+              <w:bottom w:val="none" w:sz="0" w:space="0" w:color="000000"/>
+              <w:top w:val="single" w:sz="12" w:space="0" w:color="666666"/>
+              <w:left w:val="none" w:sz="0" w:space="0" w:color="000000"/>
+              <w:right w:val="none" w:sz="0" w:space="0" w:color="000000"/>
+            </w:tcBorders>
+            <w:shd w:val="clear" w:color="auto" w:fill="FFFFFF"/>
+            <w:tcMar>
+              <w:top w:w="0" w:type="dxa"/>
+              <w:bottom w:w="0" w:type="dxa"/>
+              <w:left w:w="0" w:type="dxa"/>
+              <w:right w:w="0" w:type="dxa"/>
+            </w:tcMar>
+            <w:vAlign w:val="center"/>
+          </w:tcPr>
+          <w:p>
+            <w:pPr>
+              <w:pStyle w:val="Normal"/>
+              <w:jc w:val="left"/>
+              <w:pBdr>
+                <w:bottom w:val="none" w:sz="0" w:space="0" w:color="000000"/>
+                <w:top w:val="none" w:sz="0" w:space="0" w:color="000000"/>
+                <w:left w:val="none" w:sz="0" w:space="0" w:color="000000"/>
+                <w:right w:val="none" w:sz="0" w:space="0" w:color="000000"/>
+              </w:pBdr>
+              <w:spacing w:after="100" w:before="100" w:line="240"/>
+              <w:ind w:left="100" w:right="100" w:firstLine="0" w:firstLineChars="0"/>
+              <w:rPr>
+                <w:rFonts w:ascii="Helvetica" w:hAnsi="Helvetica" w:eastAsia="Helvetica" w:cs="Helvetica"/>
+                <w:i w:val="false"/>
+                <w:b w:val="false"/>
+                <w:u w:val="none"/>
+                <w:strike w:val="false"/>
+                <w:sz w:val="22"/>
+                <w:szCs w:val="22"/>
+                <w:color w:val="000000"/>
+              </w:rPr>
+            </w:pPr>
+            <w:r>
+              <w:rPr>
+                <w:rFonts w:ascii="Helvetica" w:hAnsi="Helvetica" w:eastAsia="Helvetica" w:cs="Helvetica"/>
+                <w:i w:val="false"/>
+                <w:b w:val="false"/>
+                <w:u w:val="none"/>
+                <w:strike w:val="false"/>
+                <w:sz w:val="22"/>
+                <w:szCs w:val="22"/>
+                <w:color w:val="000000"/>
+              </w:rPr>
+              <w:t xml:space="preserve"/>
+            </w:r>
+          </w:p>
+        </w:tc>
+      </w:tr>
+      <w:tr>
+        <w:trPr>
+          <w:trHeight w:val="608" w:hRule="auto"/>
+        </w:trPr>
+        <w:tc>
+          <w:tcPr>
+            <w:tcBorders>
+              <w:bottom w:val="none" w:sz="0" w:space="0" w:color="000000"/>
+              <w:top w:val="none" w:sz="0" w:space="0" w:color="000000"/>
+              <w:left w:val="none" w:sz="0" w:space="0" w:color="000000"/>
+              <w:right w:val="none" w:sz="0" w:space="0" w:color="000000"/>
+            </w:tcBorders>
+            <w:shd w:val="clear" w:color="auto" w:fill="FFFFFF"/>
+            <w:tcMar>
+              <w:top w:w="0" w:type="dxa"/>
+              <w:bottom w:w="0" w:type="dxa"/>
+              <w:left w:w="0" w:type="dxa"/>
+              <w:right w:w="0" w:type="dxa"/>
+            </w:tcMar>
+            <w:vAlign w:val="center"/>
+          </w:tcPr>
+          <w:p>
+            <w:pPr>
+              <w:pStyle w:val="Normal"/>
+              <w:jc w:val="left"/>
+              <w:pBdr>
+                <w:bottom w:val="none" w:sz="0" w:space="0" w:color="000000"/>
+                <w:top w:val="none" w:sz="0" w:space="0" w:color="000000"/>
+                <w:left w:val="none" w:sz="0" w:space="0" w:color="000000"/>
+                <w:right w:val="none" w:sz="0" w:space="0" w:color="000000"/>
+              </w:pBdr>
+              <w:spacing w:after="100" w:before="100" w:line="240"/>
+              <w:ind w:left="100" w:right="100" w:firstLine="0" w:firstLineChars="0"/>
+              <w:rPr>
+                <w:rFonts w:ascii="Helvetica" w:hAnsi="Helvetica" w:eastAsia="Helvetica" w:cs="Helvetica"/>
+                <w:i w:val="false"/>
+                <w:b w:val="false"/>
+                <w:u w:val="none"/>
+                <w:strike w:val="false"/>
+                <w:sz w:val="22"/>
+                <w:szCs w:val="22"/>
+                <w:color w:val="000000"/>
+              </w:rPr>
+            </w:pPr>
+            <w:r>
+              <w:rPr>
+                <w:rFonts w:ascii="Helvetica" w:hAnsi="Helvetica" w:eastAsia="Helvetica" w:cs="Helvetica"/>
+                <w:i w:val="false"/>
+                <w:b w:val="false"/>
+                <w:u w:val="none"/>
+                <w:strike w:val="false"/>
+                <w:sz w:val="22"/>
+                <w:szCs w:val="22"/>
+                <w:color w:val="000000"/>
+              </w:rPr>
+              <w:t xml:space="preserve">grimage2</w:t>
+            </w:r>
+          </w:p>
+        </w:tc>
+        <w:tc>
+          <w:tcPr>
+            <w:tcBorders>
+              <w:bottom w:val="none" w:sz="0" w:space="0" w:color="000000"/>
+              <w:top w:val="none" w:sz="0" w:space="0" w:color="000000"/>
+              <w:left w:val="none" w:sz="0" w:space="0" w:color="000000"/>
+              <w:right w:val="none" w:sz="0" w:space="0" w:color="000000"/>
+            </w:tcBorders>
+            <w:shd w:val="clear" w:color="auto" w:fill="FFFFFF"/>
+            <w:tcMar>
+              <w:top w:w="0" w:type="dxa"/>
+              <w:bottom w:w="0" w:type="dxa"/>
+              <w:left w:w="0" w:type="dxa"/>
+              <w:right w:w="0" w:type="dxa"/>
+            </w:tcMar>
+            <w:vAlign w:val="center"/>
+          </w:tcPr>
+          <w:p>
+            <w:pPr>
+              <w:pStyle w:val="Normal"/>
+              <w:jc w:val="left"/>
+              <w:pBdr>
+                <w:bottom w:val="none" w:sz="0" w:space="0" w:color="000000"/>
+                <w:top w:val="none" w:sz="0" w:space="0" w:color="000000"/>
+                <w:left w:val="none" w:sz="0" w:space="0" w:color="000000"/>
+                <w:right w:val="none" w:sz="0" w:space="0" w:color="000000"/>
+              </w:pBdr>
+              <w:spacing w:after="100" w:before="100" w:line="240"/>
+              <w:ind w:left="100" w:right="100" w:firstLine="0" w:firstLineChars="0"/>
+              <w:rPr>
+                <w:rFonts w:ascii="Helvetica" w:hAnsi="Helvetica" w:eastAsia="Helvetica" w:cs="Helvetica"/>
+                <w:i w:val="false"/>
+                <w:b w:val="false"/>
+                <w:u w:val="none"/>
+                <w:strike w:val="false"/>
+                <w:sz w:val="22"/>
+                <w:szCs w:val="22"/>
+                <w:color w:val="000000"/>
+              </w:rPr>
+            </w:pPr>
+            <w:r>
+              <w:rPr>
+                <w:rFonts w:ascii="Helvetica" w:hAnsi="Helvetica" w:eastAsia="Helvetica" w:cs="Helvetica"/>
+                <w:i w:val="false"/>
+                <w:b w:val="false"/>
+                <w:u w:val="none"/>
+                <w:strike w:val="false"/>
+                <w:sz w:val="22"/>
+                <w:szCs w:val="22"/>
+                <w:color w:val="000000"/>
+              </w:rPr>
+              <w:t xml:space="preserve">0.861</w:t>
+            </w:r>
+          </w:p>
+        </w:tc>
+        <w:tc>
+          <w:tcPr>
+            <w:tcBorders>
+              <w:bottom w:val="none" w:sz="0" w:space="0" w:color="000000"/>
+              <w:top w:val="none" w:sz="0" w:space="0" w:color="000000"/>
+              <w:left w:val="none" w:sz="0" w:space="0" w:color="000000"/>
+              <w:right w:val="none" w:sz="0" w:space="0" w:color="000000"/>
+            </w:tcBorders>
+            <w:shd w:val="clear" w:color="auto" w:fill="FFFFFF"/>
+            <w:tcMar>
+              <w:top w:w="0" w:type="dxa"/>
+              <w:bottom w:w="0" w:type="dxa"/>
+              <w:left w:w="0" w:type="dxa"/>
+              <w:right w:w="0" w:type="dxa"/>
+            </w:tcMar>
+            <w:vAlign w:val="center"/>
+          </w:tcPr>
+          <w:p>
+            <w:pPr>
+              <w:pStyle w:val="Normal"/>
+              <w:jc w:val="left"/>
+              <w:pBdr>
+                <w:bottom w:val="none" w:sz="0" w:space="0" w:color="000000"/>
+                <w:top w:val="none" w:sz="0" w:space="0" w:color="000000"/>
+                <w:left w:val="none" w:sz="0" w:space="0" w:color="000000"/>
+                <w:right w:val="none" w:sz="0" w:space="0" w:color="000000"/>
+              </w:pBdr>
+              <w:spacing w:after="100" w:before="100" w:line="240"/>
+              <w:ind w:left="100" w:right="100" w:firstLine="0" w:firstLineChars="0"/>
+              <w:rPr>
+                <w:rFonts w:ascii="Helvetica" w:hAnsi="Helvetica" w:eastAsia="Helvetica" w:cs="Helvetica"/>
+                <w:i w:val="false"/>
+                <w:b w:val="false"/>
+                <w:u w:val="none"/>
+                <w:strike w:val="false"/>
+                <w:sz w:val="22"/>
+                <w:szCs w:val="22"/>
+                <w:color w:val="000000"/>
+              </w:rPr>
+            </w:pPr>
+            <w:r>
+              <w:rPr>
+                <w:rFonts w:ascii="Helvetica" w:hAnsi="Helvetica" w:eastAsia="Helvetica" w:cs="Helvetica"/>
+                <w:i w:val="false"/>
+                <w:b w:val="false"/>
+                <w:u w:val="none"/>
+                <w:strike w:val="false"/>
+                <w:sz w:val="22"/>
+                <w:szCs w:val="22"/>
+                <w:color w:val="000000"/>
+              </w:rPr>
+              <w:t xml:space="preserve"/>
+            </w:r>
+          </w:p>
+        </w:tc>
+        <w:tc>
+          <w:tcPr>
+            <w:tcBorders>
+              <w:bottom w:val="none" w:sz="0" w:space="0" w:color="000000"/>
+              <w:top w:val="none" w:sz="0" w:space="0" w:color="000000"/>
+              <w:left w:val="none" w:sz="0" w:space="0" w:color="000000"/>
+              <w:right w:val="none" w:sz="0" w:space="0" w:color="000000"/>
+            </w:tcBorders>
+            <w:shd w:val="clear" w:color="auto" w:fill="FFFFFF"/>
+            <w:tcMar>
+              <w:top w:w="0" w:type="dxa"/>
+              <w:bottom w:w="0" w:type="dxa"/>
+              <w:left w:w="0" w:type="dxa"/>
+              <w:right w:w="0" w:type="dxa"/>
+            </w:tcMar>
+            <w:vAlign w:val="center"/>
+          </w:tcPr>
+          <w:p>
+            <w:pPr>
+              <w:pStyle w:val="Normal"/>
+              <w:jc w:val="left"/>
+              <w:pBdr>
+                <w:bottom w:val="none" w:sz="0" w:space="0" w:color="000000"/>
+                <w:top w:val="none" w:sz="0" w:space="0" w:color="000000"/>
+                <w:left w:val="none" w:sz="0" w:space="0" w:color="000000"/>
+                <w:right w:val="none" w:sz="0" w:space="0" w:color="000000"/>
+              </w:pBdr>
+              <w:spacing w:after="100" w:before="100" w:line="240"/>
+              <w:ind w:left="100" w:right="100" w:firstLine="0" w:firstLineChars="0"/>
+              <w:rPr>
+                <w:rFonts w:ascii="Helvetica" w:hAnsi="Helvetica" w:eastAsia="Helvetica" w:cs="Helvetica"/>
+                <w:i w:val="false"/>
+                <w:b w:val="false"/>
+                <w:u w:val="none"/>
+                <w:strike w:val="false"/>
+                <w:sz w:val="22"/>
+                <w:szCs w:val="22"/>
+                <w:color w:val="000000"/>
+              </w:rPr>
+            </w:pPr>
+            <w:r>
+              <w:rPr>
+                <w:rFonts w:ascii="Helvetica" w:hAnsi="Helvetica" w:eastAsia="Helvetica" w:cs="Helvetica"/>
+                <w:i w:val="false"/>
+                <w:b w:val="false"/>
+                <w:u w:val="none"/>
+                <w:strike w:val="false"/>
+                <w:sz w:val="22"/>
+                <w:szCs w:val="22"/>
+                <w:color w:val="000000"/>
+              </w:rPr>
+              <w:t xml:space="preserve"/>
+            </w:r>
+          </w:p>
+        </w:tc>
+        <w:tc>
+          <w:tcPr>
+            <w:tcBorders>
+              <w:bottom w:val="none" w:sz="0" w:space="0" w:color="000000"/>
+              <w:top w:val="none" w:sz="0" w:space="0" w:color="000000"/>
+              <w:left w:val="none" w:sz="0" w:space="0" w:color="000000"/>
+              <w:right w:val="none" w:sz="0" w:space="0" w:color="000000"/>
+            </w:tcBorders>
+            <w:shd w:val="clear" w:color="auto" w:fill="FFFFFF"/>
+            <w:tcMar>
+              <w:top w:w="0" w:type="dxa"/>
+              <w:bottom w:w="0" w:type="dxa"/>
+              <w:left w:w="0" w:type="dxa"/>
+              <w:right w:w="0" w:type="dxa"/>
+            </w:tcMar>
+            <w:vAlign w:val="center"/>
+          </w:tcPr>
+          <w:p>
+            <w:pPr>
+              <w:pStyle w:val="Normal"/>
+              <w:jc w:val="left"/>
+              <w:pBdr>
+                <w:bottom w:val="none" w:sz="0" w:space="0" w:color="000000"/>
+                <w:top w:val="none" w:sz="0" w:space="0" w:color="000000"/>
+                <w:left w:val="none" w:sz="0" w:space="0" w:color="000000"/>
+                <w:right w:val="none" w:sz="0" w:space="0" w:color="000000"/>
+              </w:pBdr>
+              <w:spacing w:after="100" w:before="100" w:line="240"/>
+              <w:ind w:left="100" w:right="100" w:firstLine="0" w:firstLineChars="0"/>
+              <w:rPr>
+                <w:rFonts w:ascii="Helvetica" w:hAnsi="Helvetica" w:eastAsia="Helvetica" w:cs="Helvetica"/>
+                <w:i w:val="false"/>
+                <w:b w:val="false"/>
+                <w:u w:val="none"/>
+                <w:strike w:val="false"/>
+                <w:sz w:val="22"/>
+                <w:szCs w:val="22"/>
+                <w:color w:val="000000"/>
+              </w:rPr>
+            </w:pPr>
+            <w:r>
+              <w:rPr>
+                <w:rFonts w:ascii="Helvetica" w:hAnsi="Helvetica" w:eastAsia="Helvetica" w:cs="Helvetica"/>
+                <w:i w:val="false"/>
+                <w:b w:val="false"/>
+                <w:u w:val="none"/>
+                <w:strike w:val="false"/>
+                <w:sz w:val="22"/>
+                <w:szCs w:val="22"/>
+                <w:color w:val="000000"/>
+              </w:rPr>
+              <w:t xml:space="preserve"/>
+            </w:r>
+          </w:p>
+        </w:tc>
+        <w:tc>
+          <w:tcPr>
+            <w:tcBorders>
+              <w:bottom w:val="none" w:sz="0" w:space="0" w:color="000000"/>
+              <w:top w:val="none" w:sz="0" w:space="0" w:color="000000"/>
+              <w:left w:val="none" w:sz="0" w:space="0" w:color="000000"/>
+              <w:right w:val="none" w:sz="0" w:space="0" w:color="000000"/>
+            </w:tcBorders>
+            <w:shd w:val="clear" w:color="auto" w:fill="FFFFFF"/>
+            <w:tcMar>
+              <w:top w:w="0" w:type="dxa"/>
+              <w:bottom w:w="0" w:type="dxa"/>
+              <w:left w:w="0" w:type="dxa"/>
+              <w:right w:w="0" w:type="dxa"/>
+            </w:tcMar>
+            <w:vAlign w:val="center"/>
+          </w:tcPr>
+          <w:p>
+            <w:pPr>
+              <w:pStyle w:val="Normal"/>
+              <w:jc w:val="left"/>
+              <w:pBdr>
+                <w:bottom w:val="none" w:sz="0" w:space="0" w:color="000000"/>
+                <w:top w:val="none" w:sz="0" w:space="0" w:color="000000"/>
+                <w:left w:val="none" w:sz="0" w:space="0" w:color="000000"/>
+                <w:right w:val="none" w:sz="0" w:space="0" w:color="000000"/>
+              </w:pBdr>
+              <w:spacing w:after="100" w:before="100" w:line="240"/>
+              <w:ind w:left="100" w:right="100" w:firstLine="0" w:firstLineChars="0"/>
+              <w:rPr>
+                <w:rFonts w:ascii="Helvetica" w:hAnsi="Helvetica" w:eastAsia="Helvetica" w:cs="Helvetica"/>
+                <w:i w:val="false"/>
+                <w:b w:val="false"/>
+                <w:u w:val="none"/>
+                <w:strike w:val="false"/>
+                <w:sz w:val="22"/>
+                <w:szCs w:val="22"/>
+                <w:color w:val="000000"/>
+              </w:rPr>
+            </w:pPr>
+            <w:r>
+              <w:rPr>
+                <w:rFonts w:ascii="Helvetica" w:hAnsi="Helvetica" w:eastAsia="Helvetica" w:cs="Helvetica"/>
+                <w:i w:val="false"/>
+                <w:b w:val="false"/>
+                <w:u w:val="none"/>
+                <w:strike w:val="false"/>
+                <w:sz w:val="22"/>
+                <w:szCs w:val="22"/>
+                <w:color w:val="000000"/>
+              </w:rPr>
+              <w:t xml:space="preserve"/>
+            </w:r>
+          </w:p>
+        </w:tc>
+        <w:tc>
+          <w:tcPr>
+            <w:tcBorders>
+              <w:bottom w:val="none" w:sz="0" w:space="0" w:color="000000"/>
+              <w:top w:val="none" w:sz="0" w:space="0" w:color="000000"/>
+              <w:left w:val="none" w:sz="0" w:space="0" w:color="000000"/>
+              <w:right w:val="none" w:sz="0" w:space="0" w:color="000000"/>
+            </w:tcBorders>
+            <w:shd w:val="clear" w:color="auto" w:fill="FFFFFF"/>
+            <w:tcMar>
+              <w:top w:w="0" w:type="dxa"/>
+              <w:bottom w:w="0" w:type="dxa"/>
+              <w:left w:w="0" w:type="dxa"/>
+              <w:right w:w="0" w:type="dxa"/>
+            </w:tcMar>
+            <w:vAlign w:val="center"/>
+          </w:tcPr>
+          <w:p>
+            <w:pPr>
+              <w:pStyle w:val="Normal"/>
+              <w:jc w:val="left"/>
+              <w:pBdr>
+                <w:bottom w:val="none" w:sz="0" w:space="0" w:color="000000"/>
+                <w:top w:val="none" w:sz="0" w:space="0" w:color="000000"/>
+                <w:left w:val="none" w:sz="0" w:space="0" w:color="000000"/>
+                <w:right w:val="none" w:sz="0" w:space="0" w:color="000000"/>
+              </w:pBdr>
+              <w:spacing w:after="100" w:before="100" w:line="240"/>
+              <w:ind w:left="100" w:right="100" w:firstLine="0" w:firstLineChars="0"/>
+              <w:rPr>
+                <w:rFonts w:ascii="Helvetica" w:hAnsi="Helvetica" w:eastAsia="Helvetica" w:cs="Helvetica"/>
+                <w:i w:val="false"/>
+                <w:b w:val="false"/>
+                <w:u w:val="none"/>
+                <w:strike w:val="false"/>
+                <w:sz w:val="22"/>
+                <w:szCs w:val="22"/>
+                <w:color w:val="000000"/>
+              </w:rPr>
+            </w:pPr>
+            <w:r>
+              <w:rPr>
+                <w:rFonts w:ascii="Helvetica" w:hAnsi="Helvetica" w:eastAsia="Helvetica" w:cs="Helvetica"/>
+                <w:i w:val="false"/>
+                <w:b w:val="false"/>
+                <w:u w:val="none"/>
+                <w:strike w:val="false"/>
+                <w:sz w:val="22"/>
+                <w:szCs w:val="22"/>
+                <w:color w:val="000000"/>
+              </w:rPr>
+              <w:t xml:space="preserve"/>
+            </w:r>
+          </w:p>
+        </w:tc>
+      </w:tr>
+      <w:tr>
+        <w:trPr>
+          <w:trHeight w:val="608" w:hRule="auto"/>
+        </w:trPr>
+        <w:tc>
+          <w:tcPr>
+            <w:tcBorders>
+              <w:bottom w:val="none" w:sz="0" w:space="0" w:color="000000"/>
+              <w:top w:val="none" w:sz="0" w:space="0" w:color="000000"/>
+              <w:left w:val="none" w:sz="0" w:space="0" w:color="000000"/>
+              <w:right w:val="none" w:sz="0" w:space="0" w:color="000000"/>
+            </w:tcBorders>
+            <w:shd w:val="clear" w:color="auto" w:fill="FFFFFF"/>
+            <w:tcMar>
+              <w:top w:w="0" w:type="dxa"/>
+              <w:bottom w:w="0" w:type="dxa"/>
+              <w:left w:w="0" w:type="dxa"/>
+              <w:right w:w="0" w:type="dxa"/>
+            </w:tcMar>
+            <w:vAlign w:val="center"/>
+          </w:tcPr>
+          <w:p>
+            <w:pPr>
+              <w:pStyle w:val="Normal"/>
+              <w:jc w:val="left"/>
+              <w:pBdr>
+                <w:bottom w:val="none" w:sz="0" w:space="0" w:color="000000"/>
+                <w:top w:val="none" w:sz="0" w:space="0" w:color="000000"/>
+                <w:left w:val="none" w:sz="0" w:space="0" w:color="000000"/>
+                <w:right w:val="none" w:sz="0" w:space="0" w:color="000000"/>
+              </w:pBdr>
+              <w:spacing w:after="100" w:before="100" w:line="240"/>
+              <w:ind w:left="100" w:right="100" w:firstLine="0" w:firstLineChars="0"/>
+              <w:rPr>
+                <w:rFonts w:ascii="Helvetica" w:hAnsi="Helvetica" w:eastAsia="Helvetica" w:cs="Helvetica"/>
+                <w:i w:val="false"/>
+                <w:b w:val="false"/>
+                <w:u w:val="none"/>
+                <w:strike w:val="false"/>
+                <w:sz w:val="22"/>
+                <w:szCs w:val="22"/>
+                <w:color w:val="000000"/>
+              </w:rPr>
+            </w:pPr>
+            <w:r>
+              <w:rPr>
+                <w:rFonts w:ascii="Helvetica" w:hAnsi="Helvetica" w:eastAsia="Helvetica" w:cs="Helvetica"/>
+                <w:i w:val="false"/>
+                <w:b w:val="false"/>
+                <w:u w:val="none"/>
+                <w:strike w:val="false"/>
+                <w:sz w:val="22"/>
+                <w:szCs w:val="22"/>
+                <w:color w:val="000000"/>
+              </w:rPr>
+              <w:t xml:space="preserve">dunedinpace</w:t>
+            </w:r>
+          </w:p>
+        </w:tc>
+        <w:tc>
+          <w:tcPr>
+            <w:tcBorders>
+              <w:bottom w:val="none" w:sz="0" w:space="0" w:color="000000"/>
+              <w:top w:val="none" w:sz="0" w:space="0" w:color="000000"/>
+              <w:left w:val="none" w:sz="0" w:space="0" w:color="000000"/>
+              <w:right w:val="none" w:sz="0" w:space="0" w:color="000000"/>
+            </w:tcBorders>
+            <w:shd w:val="clear" w:color="auto" w:fill="FFFFFF"/>
+            <w:tcMar>
+              <w:top w:w="0" w:type="dxa"/>
+              <w:bottom w:w="0" w:type="dxa"/>
+              <w:left w:w="0" w:type="dxa"/>
+              <w:right w:w="0" w:type="dxa"/>
+            </w:tcMar>
+            <w:vAlign w:val="center"/>
+          </w:tcPr>
+          <w:p>
+            <w:pPr>
+              <w:pStyle w:val="Normal"/>
+              <w:jc w:val="left"/>
+              <w:pBdr>
+                <w:bottom w:val="none" w:sz="0" w:space="0" w:color="000000"/>
+                <w:top w:val="none" w:sz="0" w:space="0" w:color="000000"/>
+                <w:left w:val="none" w:sz="0" w:space="0" w:color="000000"/>
+                <w:right w:val="none" w:sz="0" w:space="0" w:color="000000"/>
+              </w:pBdr>
+              <w:spacing w:after="100" w:before="100" w:line="240"/>
+              <w:ind w:left="100" w:right="100" w:firstLine="0" w:firstLineChars="0"/>
+              <w:rPr>
+                <w:rFonts w:ascii="Helvetica" w:hAnsi="Helvetica" w:eastAsia="Helvetica" w:cs="Helvetica"/>
+                <w:i w:val="false"/>
+                <w:b w:val="false"/>
+                <w:u w:val="none"/>
+                <w:strike w:val="false"/>
+                <w:sz w:val="22"/>
+                <w:szCs w:val="22"/>
+                <w:color w:val="000000"/>
+              </w:rPr>
+            </w:pPr>
+            <w:r>
+              <w:rPr>
+                <w:rFonts w:ascii="Helvetica" w:hAnsi="Helvetica" w:eastAsia="Helvetica" w:cs="Helvetica"/>
+                <w:i w:val="false"/>
+                <w:b w:val="false"/>
+                <w:u w:val="none"/>
+                <w:strike w:val="false"/>
+                <w:sz w:val="22"/>
+                <w:szCs w:val="22"/>
+                <w:color w:val="000000"/>
+              </w:rPr>
+              <w:t xml:space="preserve">0.190</w:t>
+            </w:r>
+          </w:p>
+        </w:tc>
+        <w:tc>
+          <w:tcPr>
+            <w:tcBorders>
+              <w:bottom w:val="none" w:sz="0" w:space="0" w:color="000000"/>
+              <w:top w:val="none" w:sz="0" w:space="0" w:color="000000"/>
+              <w:left w:val="none" w:sz="0" w:space="0" w:color="000000"/>
+              <w:right w:val="none" w:sz="0" w:space="0" w:color="000000"/>
+            </w:tcBorders>
+            <w:shd w:val="clear" w:color="auto" w:fill="FFFFFF"/>
+            <w:tcMar>
+              <w:top w:w="0" w:type="dxa"/>
+              <w:bottom w:w="0" w:type="dxa"/>
+              <w:left w:w="0" w:type="dxa"/>
+              <w:right w:w="0" w:type="dxa"/>
+            </w:tcMar>
+            <w:vAlign w:val="center"/>
+          </w:tcPr>
+          <w:p>
+            <w:pPr>
+              <w:pStyle w:val="Normal"/>
+              <w:jc w:val="left"/>
+              <w:pBdr>
+                <w:bottom w:val="none" w:sz="0" w:space="0" w:color="000000"/>
+                <w:top w:val="none" w:sz="0" w:space="0" w:color="000000"/>
+                <w:left w:val="none" w:sz="0" w:space="0" w:color="000000"/>
+                <w:right w:val="none" w:sz="0" w:space="0" w:color="000000"/>
+              </w:pBdr>
+              <w:spacing w:after="100" w:before="100" w:line="240"/>
+              <w:ind w:left="100" w:right="100" w:firstLine="0" w:firstLineChars="0"/>
+              <w:rPr>
+                <w:rFonts w:ascii="Helvetica" w:hAnsi="Helvetica" w:eastAsia="Helvetica" w:cs="Helvetica"/>
+                <w:i w:val="false"/>
+                <w:b w:val="false"/>
+                <w:u w:val="none"/>
+                <w:strike w:val="false"/>
+                <w:sz w:val="22"/>
+                <w:szCs w:val="22"/>
+                <w:color w:val="000000"/>
+              </w:rPr>
+            </w:pPr>
+            <w:r>
+              <w:rPr>
+                <w:rFonts w:ascii="Helvetica" w:hAnsi="Helvetica" w:eastAsia="Helvetica" w:cs="Helvetica"/>
+                <w:i w:val="false"/>
+                <w:b w:val="false"/>
+                <w:u w:val="none"/>
+                <w:strike w:val="false"/>
+                <w:sz w:val="22"/>
+                <w:szCs w:val="22"/>
+                <w:color w:val="000000"/>
+              </w:rPr>
+              <w:t xml:space="preserve">0.539</w:t>
+            </w:r>
+          </w:p>
+        </w:tc>
+        <w:tc>
+          <w:tcPr>
+            <w:tcBorders>
+              <w:bottom w:val="none" w:sz="0" w:space="0" w:color="000000"/>
+              <w:top w:val="none" w:sz="0" w:space="0" w:color="000000"/>
+              <w:left w:val="none" w:sz="0" w:space="0" w:color="000000"/>
+              <w:right w:val="none" w:sz="0" w:space="0" w:color="000000"/>
+            </w:tcBorders>
+            <w:shd w:val="clear" w:color="auto" w:fill="FFFFFF"/>
+            <w:tcMar>
+              <w:top w:w="0" w:type="dxa"/>
+              <w:bottom w:w="0" w:type="dxa"/>
+              <w:left w:w="0" w:type="dxa"/>
+              <w:right w:w="0" w:type="dxa"/>
+            </w:tcMar>
+            <w:vAlign w:val="center"/>
+          </w:tcPr>
+          <w:p>
+            <w:pPr>
+              <w:pStyle w:val="Normal"/>
+              <w:jc w:val="left"/>
+              <w:pBdr>
+                <w:bottom w:val="none" w:sz="0" w:space="0" w:color="000000"/>
+                <w:top w:val="none" w:sz="0" w:space="0" w:color="000000"/>
+                <w:left w:val="none" w:sz="0" w:space="0" w:color="000000"/>
+                <w:right w:val="none" w:sz="0" w:space="0" w:color="000000"/>
+              </w:pBdr>
+              <w:spacing w:after="100" w:before="100" w:line="240"/>
+              <w:ind w:left="100" w:right="100" w:firstLine="0" w:firstLineChars="0"/>
+              <w:rPr>
+                <w:rFonts w:ascii="Helvetica" w:hAnsi="Helvetica" w:eastAsia="Helvetica" w:cs="Helvetica"/>
+                <w:i w:val="false"/>
+                <w:b w:val="false"/>
+                <w:u w:val="none"/>
+                <w:strike w:val="false"/>
+                <w:sz w:val="22"/>
+                <w:szCs w:val="22"/>
+                <w:color w:val="000000"/>
+              </w:rPr>
+            </w:pPr>
+            <w:r>
+              <w:rPr>
+                <w:rFonts w:ascii="Helvetica" w:hAnsi="Helvetica" w:eastAsia="Helvetica" w:cs="Helvetica"/>
+                <w:i w:val="false"/>
+                <w:b w:val="false"/>
+                <w:u w:val="none"/>
+                <w:strike w:val="false"/>
+                <w:sz w:val="22"/>
+                <w:szCs w:val="22"/>
+                <w:color w:val="000000"/>
+              </w:rPr>
+              <w:t xml:space="preserve"/>
+            </w:r>
+          </w:p>
+        </w:tc>
+        <w:tc>
+          <w:tcPr>
+            <w:tcBorders>
+              <w:bottom w:val="none" w:sz="0" w:space="0" w:color="000000"/>
+              <w:top w:val="none" w:sz="0" w:space="0" w:color="000000"/>
+              <w:left w:val="none" w:sz="0" w:space="0" w:color="000000"/>
+              <w:right w:val="none" w:sz="0" w:space="0" w:color="000000"/>
+            </w:tcBorders>
+            <w:shd w:val="clear" w:color="auto" w:fill="FFFFFF"/>
+            <w:tcMar>
+              <w:top w:w="0" w:type="dxa"/>
+              <w:bottom w:w="0" w:type="dxa"/>
+              <w:left w:w="0" w:type="dxa"/>
+              <w:right w:w="0" w:type="dxa"/>
+            </w:tcMar>
+            <w:vAlign w:val="center"/>
+          </w:tcPr>
+          <w:p>
+            <w:pPr>
+              <w:pStyle w:val="Normal"/>
+              <w:jc w:val="left"/>
+              <w:pBdr>
+                <w:bottom w:val="none" w:sz="0" w:space="0" w:color="000000"/>
+                <w:top w:val="none" w:sz="0" w:space="0" w:color="000000"/>
+                <w:left w:val="none" w:sz="0" w:space="0" w:color="000000"/>
+                <w:right w:val="none" w:sz="0" w:space="0" w:color="000000"/>
+              </w:pBdr>
+              <w:spacing w:after="100" w:before="100" w:line="240"/>
+              <w:ind w:left="100" w:right="100" w:firstLine="0" w:firstLineChars="0"/>
+              <w:rPr>
+                <w:rFonts w:ascii="Helvetica" w:hAnsi="Helvetica" w:eastAsia="Helvetica" w:cs="Helvetica"/>
+                <w:i w:val="false"/>
+                <w:b w:val="false"/>
+                <w:u w:val="none"/>
+                <w:strike w:val="false"/>
+                <w:sz w:val="22"/>
+                <w:szCs w:val="22"/>
+                <w:color w:val="000000"/>
+              </w:rPr>
+            </w:pPr>
+            <w:r>
+              <w:rPr>
+                <w:rFonts w:ascii="Helvetica" w:hAnsi="Helvetica" w:eastAsia="Helvetica" w:cs="Helvetica"/>
+                <w:i w:val="false"/>
+                <w:b w:val="false"/>
+                <w:u w:val="none"/>
+                <w:strike w:val="false"/>
+                <w:sz w:val="22"/>
+                <w:szCs w:val="22"/>
+                <w:color w:val="000000"/>
+              </w:rPr>
+              <w:t xml:space="preserve"/>
+            </w:r>
+          </w:p>
+        </w:tc>
+        <w:tc>
+          <w:tcPr>
+            <w:tcBorders>
+              <w:bottom w:val="none" w:sz="0" w:space="0" w:color="000000"/>
+              <w:top w:val="none" w:sz="0" w:space="0" w:color="000000"/>
+              <w:left w:val="none" w:sz="0" w:space="0" w:color="000000"/>
+              <w:right w:val="none" w:sz="0" w:space="0" w:color="000000"/>
+            </w:tcBorders>
+            <w:shd w:val="clear" w:color="auto" w:fill="FFFFFF"/>
+            <w:tcMar>
+              <w:top w:w="0" w:type="dxa"/>
+              <w:bottom w:w="0" w:type="dxa"/>
+              <w:left w:w="0" w:type="dxa"/>
+              <w:right w:w="0" w:type="dxa"/>
+            </w:tcMar>
+            <w:vAlign w:val="center"/>
+          </w:tcPr>
+          <w:p>
+            <w:pPr>
+              <w:pStyle w:val="Normal"/>
+              <w:jc w:val="left"/>
+              <w:pBdr>
+                <w:bottom w:val="none" w:sz="0" w:space="0" w:color="000000"/>
+                <w:top w:val="none" w:sz="0" w:space="0" w:color="000000"/>
+                <w:left w:val="none" w:sz="0" w:space="0" w:color="000000"/>
+                <w:right w:val="none" w:sz="0" w:space="0" w:color="000000"/>
+              </w:pBdr>
+              <w:spacing w:after="100" w:before="100" w:line="240"/>
+              <w:ind w:left="100" w:right="100" w:firstLine="0" w:firstLineChars="0"/>
+              <w:rPr>
+                <w:rFonts w:ascii="Helvetica" w:hAnsi="Helvetica" w:eastAsia="Helvetica" w:cs="Helvetica"/>
+                <w:i w:val="false"/>
+                <w:b w:val="false"/>
+                <w:u w:val="none"/>
+                <w:strike w:val="false"/>
+                <w:sz w:val="22"/>
+                <w:szCs w:val="22"/>
+                <w:color w:val="000000"/>
+              </w:rPr>
+            </w:pPr>
+            <w:r>
+              <w:rPr>
+                <w:rFonts w:ascii="Helvetica" w:hAnsi="Helvetica" w:eastAsia="Helvetica" w:cs="Helvetica"/>
+                <w:i w:val="false"/>
+                <w:b w:val="false"/>
+                <w:u w:val="none"/>
+                <w:strike w:val="false"/>
+                <w:sz w:val="22"/>
+                <w:szCs w:val="22"/>
+                <w:color w:val="000000"/>
+              </w:rPr>
+              <w:t xml:space="preserve"/>
+            </w:r>
+          </w:p>
+        </w:tc>
+        <w:tc>
+          <w:tcPr>
+            <w:tcBorders>
+              <w:bottom w:val="none" w:sz="0" w:space="0" w:color="000000"/>
+              <w:top w:val="none" w:sz="0" w:space="0" w:color="000000"/>
+              <w:left w:val="none" w:sz="0" w:space="0" w:color="000000"/>
+              <w:right w:val="none" w:sz="0" w:space="0" w:color="000000"/>
+            </w:tcBorders>
+            <w:shd w:val="clear" w:color="auto" w:fill="FFFFFF"/>
+            <w:tcMar>
+              <w:top w:w="0" w:type="dxa"/>
+              <w:bottom w:w="0" w:type="dxa"/>
+              <w:left w:w="0" w:type="dxa"/>
+              <w:right w:w="0" w:type="dxa"/>
+            </w:tcMar>
+            <w:vAlign w:val="center"/>
+          </w:tcPr>
+          <w:p>
+            <w:pPr>
+              <w:pStyle w:val="Normal"/>
+              <w:jc w:val="left"/>
+              <w:pBdr>
+                <w:bottom w:val="none" w:sz="0" w:space="0" w:color="000000"/>
+                <w:top w:val="none" w:sz="0" w:space="0" w:color="000000"/>
+                <w:left w:val="none" w:sz="0" w:space="0" w:color="000000"/>
+                <w:right w:val="none" w:sz="0" w:space="0" w:color="000000"/>
+              </w:pBdr>
+              <w:spacing w:after="100" w:before="100" w:line="240"/>
+              <w:ind w:left="100" w:right="100" w:firstLine="0" w:firstLineChars="0"/>
+              <w:rPr>
+                <w:rFonts w:ascii="Helvetica" w:hAnsi="Helvetica" w:eastAsia="Helvetica" w:cs="Helvetica"/>
+                <w:i w:val="false"/>
+                <w:b w:val="false"/>
+                <w:u w:val="none"/>
+                <w:strike w:val="false"/>
+                <w:sz w:val="22"/>
+                <w:szCs w:val="22"/>
+                <w:color w:val="000000"/>
+              </w:rPr>
+            </w:pPr>
+            <w:r>
+              <w:rPr>
+                <w:rFonts w:ascii="Helvetica" w:hAnsi="Helvetica" w:eastAsia="Helvetica" w:cs="Helvetica"/>
+                <w:i w:val="false"/>
+                <w:b w:val="false"/>
+                <w:u w:val="none"/>
+                <w:strike w:val="false"/>
+                <w:sz w:val="22"/>
+                <w:szCs w:val="22"/>
+                <w:color w:val="000000"/>
+              </w:rPr>
+              <w:t xml:space="preserve"/>
+            </w:r>
+          </w:p>
+        </w:tc>
+      </w:tr>
+      <w:tr>
+        <w:trPr>
+          <w:trHeight w:val="608" w:hRule="auto"/>
+        </w:trPr>
+        <w:tc>
+          <w:tcPr>
+            <w:tcBorders>
+              <w:bottom w:val="none" w:sz="0" w:space="0" w:color="000000"/>
+              <w:top w:val="none" w:sz="0" w:space="0" w:color="000000"/>
+              <w:left w:val="none" w:sz="0" w:space="0" w:color="000000"/>
+              <w:right w:val="none" w:sz="0" w:space="0" w:color="000000"/>
+            </w:tcBorders>
+            <w:shd w:val="clear" w:color="auto" w:fill="FFFFFF"/>
+            <w:tcMar>
+              <w:top w:w="0" w:type="dxa"/>
+              <w:bottom w:w="0" w:type="dxa"/>
+              <w:left w:w="0" w:type="dxa"/>
+              <w:right w:w="0" w:type="dxa"/>
+            </w:tcMar>
+            <w:vAlign w:val="center"/>
+          </w:tcPr>
+          <w:p>
+            <w:pPr>
+              <w:pStyle w:val="Normal"/>
+              <w:jc w:val="left"/>
+              <w:pBdr>
+                <w:bottom w:val="none" w:sz="0" w:space="0" w:color="000000"/>
+                <w:top w:val="none" w:sz="0" w:space="0" w:color="000000"/>
+                <w:left w:val="none" w:sz="0" w:space="0" w:color="000000"/>
+                <w:right w:val="none" w:sz="0" w:space="0" w:color="000000"/>
+              </w:pBdr>
+              <w:spacing w:after="100" w:before="100" w:line="240"/>
+              <w:ind w:left="100" w:right="100" w:firstLine="0" w:firstLineChars="0"/>
+              <w:rPr>
+                <w:rFonts w:ascii="Helvetica" w:hAnsi="Helvetica" w:eastAsia="Helvetica" w:cs="Helvetica"/>
+                <w:i w:val="false"/>
+                <w:b w:val="false"/>
+                <w:u w:val="none"/>
+                <w:strike w:val="false"/>
+                <w:sz w:val="22"/>
+                <w:szCs w:val="22"/>
+                <w:color w:val="000000"/>
+              </w:rPr>
+            </w:pPr>
+            <w:r>
+              <w:rPr>
+                <w:rFonts w:ascii="Helvetica" w:hAnsi="Helvetica" w:eastAsia="Helvetica" w:cs="Helvetica"/>
+                <w:i w:val="false"/>
+                <w:b w:val="false"/>
+                <w:u w:val="none"/>
+                <w:strike w:val="false"/>
+                <w:sz w:val="22"/>
+                <w:szCs w:val="22"/>
+                <w:color w:val="000000"/>
+              </w:rPr>
+              <w:t xml:space="preserve">num_chron</w:t>
+            </w:r>
+          </w:p>
+        </w:tc>
+        <w:tc>
+          <w:tcPr>
+            <w:tcBorders>
+              <w:bottom w:val="none" w:sz="0" w:space="0" w:color="000000"/>
+              <w:top w:val="none" w:sz="0" w:space="0" w:color="000000"/>
+              <w:left w:val="none" w:sz="0" w:space="0" w:color="000000"/>
+              <w:right w:val="none" w:sz="0" w:space="0" w:color="000000"/>
+            </w:tcBorders>
+            <w:shd w:val="clear" w:color="auto" w:fill="FFFFFF"/>
+            <w:tcMar>
+              <w:top w:w="0" w:type="dxa"/>
+              <w:bottom w:w="0" w:type="dxa"/>
+              <w:left w:w="0" w:type="dxa"/>
+              <w:right w:w="0" w:type="dxa"/>
+            </w:tcMar>
+            <w:vAlign w:val="center"/>
+          </w:tcPr>
+          <w:p>
+            <w:pPr>
+              <w:pStyle w:val="Normal"/>
+              <w:jc w:val="left"/>
+              <w:pBdr>
+                <w:bottom w:val="none" w:sz="0" w:space="0" w:color="000000"/>
+                <w:top w:val="none" w:sz="0" w:space="0" w:color="000000"/>
+                <w:left w:val="none" w:sz="0" w:space="0" w:color="000000"/>
+                <w:right w:val="none" w:sz="0" w:space="0" w:color="000000"/>
+              </w:pBdr>
+              <w:spacing w:after="100" w:before="100" w:line="240"/>
+              <w:ind w:left="100" w:right="100" w:firstLine="0" w:firstLineChars="0"/>
+              <w:rPr>
+                <w:rFonts w:ascii="Helvetica" w:hAnsi="Helvetica" w:eastAsia="Helvetica" w:cs="Helvetica"/>
+                <w:i w:val="false"/>
+                <w:b w:val="false"/>
+                <w:u w:val="none"/>
+                <w:strike w:val="false"/>
+                <w:sz w:val="22"/>
+                <w:szCs w:val="22"/>
+                <w:color w:val="000000"/>
+              </w:rPr>
+            </w:pPr>
+            <w:r>
+              <w:rPr>
+                <w:rFonts w:ascii="Helvetica" w:hAnsi="Helvetica" w:eastAsia="Helvetica" w:cs="Helvetica"/>
+                <w:i w:val="false"/>
+                <w:b w:val="false"/>
+                <w:u w:val="none"/>
+                <w:strike w:val="false"/>
+                <w:sz w:val="22"/>
+                <w:szCs w:val="22"/>
+                <w:color w:val="000000"/>
+              </w:rPr>
+              <w:t xml:space="preserve">0.088</w:t>
+            </w:r>
+          </w:p>
+        </w:tc>
+        <w:tc>
+          <w:tcPr>
+            <w:tcBorders>
+              <w:bottom w:val="none" w:sz="0" w:space="0" w:color="000000"/>
+              <w:top w:val="none" w:sz="0" w:space="0" w:color="000000"/>
+              <w:left w:val="none" w:sz="0" w:space="0" w:color="000000"/>
+              <w:right w:val="none" w:sz="0" w:space="0" w:color="000000"/>
+            </w:tcBorders>
+            <w:shd w:val="clear" w:color="auto" w:fill="FFFFFF"/>
+            <w:tcMar>
+              <w:top w:w="0" w:type="dxa"/>
+              <w:bottom w:w="0" w:type="dxa"/>
+              <w:left w:w="0" w:type="dxa"/>
+              <w:right w:w="0" w:type="dxa"/>
+            </w:tcMar>
+            <w:vAlign w:val="center"/>
+          </w:tcPr>
+          <w:p>
+            <w:pPr>
+              <w:pStyle w:val="Normal"/>
+              <w:jc w:val="left"/>
+              <w:pBdr>
+                <w:bottom w:val="none" w:sz="0" w:space="0" w:color="000000"/>
+                <w:top w:val="none" w:sz="0" w:space="0" w:color="000000"/>
+                <w:left w:val="none" w:sz="0" w:space="0" w:color="000000"/>
+                <w:right w:val="none" w:sz="0" w:space="0" w:color="000000"/>
+              </w:pBdr>
+              <w:spacing w:after="100" w:before="100" w:line="240"/>
+              <w:ind w:left="100" w:right="100" w:firstLine="0" w:firstLineChars="0"/>
+              <w:rPr>
+                <w:rFonts w:ascii="Helvetica" w:hAnsi="Helvetica" w:eastAsia="Helvetica" w:cs="Helvetica"/>
+                <w:i w:val="false"/>
+                <w:b w:val="false"/>
+                <w:u w:val="none"/>
+                <w:strike w:val="false"/>
+                <w:sz w:val="22"/>
+                <w:szCs w:val="22"/>
+                <w:color w:val="000000"/>
+              </w:rPr>
+            </w:pPr>
+            <w:r>
+              <w:rPr>
+                <w:rFonts w:ascii="Helvetica" w:hAnsi="Helvetica" w:eastAsia="Helvetica" w:cs="Helvetica"/>
+                <w:i w:val="false"/>
+                <w:b w:val="false"/>
+                <w:u w:val="none"/>
+                <w:strike w:val="false"/>
+                <w:sz w:val="22"/>
+                <w:szCs w:val="22"/>
+                <w:color w:val="000000"/>
+              </w:rPr>
+              <w:t xml:space="preserve">0.173</w:t>
+            </w:r>
+          </w:p>
+        </w:tc>
+        <w:tc>
+          <w:tcPr>
+            <w:tcBorders>
+              <w:bottom w:val="none" w:sz="0" w:space="0" w:color="000000"/>
+              <w:top w:val="none" w:sz="0" w:space="0" w:color="000000"/>
+              <w:left w:val="none" w:sz="0" w:space="0" w:color="000000"/>
+              <w:right w:val="none" w:sz="0" w:space="0" w:color="000000"/>
+            </w:tcBorders>
+            <w:shd w:val="clear" w:color="auto" w:fill="FFFFFF"/>
+            <w:tcMar>
+              <w:top w:w="0" w:type="dxa"/>
+              <w:bottom w:w="0" w:type="dxa"/>
+              <w:left w:w="0" w:type="dxa"/>
+              <w:right w:w="0" w:type="dxa"/>
+            </w:tcMar>
+            <w:vAlign w:val="center"/>
+          </w:tcPr>
+          <w:p>
+            <w:pPr>
+              <w:pStyle w:val="Normal"/>
+              <w:jc w:val="left"/>
+              <w:pBdr>
+                <w:bottom w:val="none" w:sz="0" w:space="0" w:color="000000"/>
+                <w:top w:val="none" w:sz="0" w:space="0" w:color="000000"/>
+                <w:left w:val="none" w:sz="0" w:space="0" w:color="000000"/>
+                <w:right w:val="none" w:sz="0" w:space="0" w:color="000000"/>
+              </w:pBdr>
+              <w:spacing w:after="100" w:before="100" w:line="240"/>
+              <w:ind w:left="100" w:right="100" w:firstLine="0" w:firstLineChars="0"/>
+              <w:rPr>
+                <w:rFonts w:ascii="Helvetica" w:hAnsi="Helvetica" w:eastAsia="Helvetica" w:cs="Helvetica"/>
+                <w:i w:val="false"/>
+                <w:b w:val="false"/>
+                <w:u w:val="none"/>
+                <w:strike w:val="false"/>
+                <w:sz w:val="22"/>
+                <w:szCs w:val="22"/>
+                <w:color w:val="000000"/>
+              </w:rPr>
+            </w:pPr>
+            <w:r>
+              <w:rPr>
+                <w:rFonts w:ascii="Helvetica" w:hAnsi="Helvetica" w:eastAsia="Helvetica" w:cs="Helvetica"/>
+                <w:i w:val="false"/>
+                <w:b w:val="false"/>
+                <w:u w:val="none"/>
+                <w:strike w:val="false"/>
+                <w:sz w:val="22"/>
+                <w:szCs w:val="22"/>
+                <w:color w:val="000000"/>
+              </w:rPr>
+              <w:t xml:space="preserve">0.202</w:t>
+            </w:r>
+          </w:p>
+        </w:tc>
+        <w:tc>
+          <w:tcPr>
+            <w:tcBorders>
+              <w:bottom w:val="none" w:sz="0" w:space="0" w:color="000000"/>
+              <w:top w:val="none" w:sz="0" w:space="0" w:color="000000"/>
+              <w:left w:val="none" w:sz="0" w:space="0" w:color="000000"/>
+              <w:right w:val="none" w:sz="0" w:space="0" w:color="000000"/>
+            </w:tcBorders>
+            <w:shd w:val="clear" w:color="auto" w:fill="FFFFFF"/>
+            <w:tcMar>
+              <w:top w:w="0" w:type="dxa"/>
+              <w:bottom w:w="0" w:type="dxa"/>
+              <w:left w:w="0" w:type="dxa"/>
+              <w:right w:w="0" w:type="dxa"/>
+            </w:tcMar>
+            <w:vAlign w:val="center"/>
+          </w:tcPr>
+          <w:p>
+            <w:pPr>
+              <w:pStyle w:val="Normal"/>
+              <w:jc w:val="left"/>
+              <w:pBdr>
+                <w:bottom w:val="none" w:sz="0" w:space="0" w:color="000000"/>
+                <w:top w:val="none" w:sz="0" w:space="0" w:color="000000"/>
+                <w:left w:val="none" w:sz="0" w:space="0" w:color="000000"/>
+                <w:right w:val="none" w:sz="0" w:space="0" w:color="000000"/>
+              </w:pBdr>
+              <w:spacing w:after="100" w:before="100" w:line="240"/>
+              <w:ind w:left="100" w:right="100" w:firstLine="0" w:firstLineChars="0"/>
+              <w:rPr>
+                <w:rFonts w:ascii="Helvetica" w:hAnsi="Helvetica" w:eastAsia="Helvetica" w:cs="Helvetica"/>
+                <w:i w:val="false"/>
+                <w:b w:val="false"/>
+                <w:u w:val="none"/>
+                <w:strike w:val="false"/>
+                <w:sz w:val="22"/>
+                <w:szCs w:val="22"/>
+                <w:color w:val="000000"/>
+              </w:rPr>
+            </w:pPr>
+            <w:r>
+              <w:rPr>
+                <w:rFonts w:ascii="Helvetica" w:hAnsi="Helvetica" w:eastAsia="Helvetica" w:cs="Helvetica"/>
+                <w:i w:val="false"/>
+                <w:b w:val="false"/>
+                <w:u w:val="none"/>
+                <w:strike w:val="false"/>
+                <w:sz w:val="22"/>
+                <w:szCs w:val="22"/>
+                <w:color w:val="000000"/>
+              </w:rPr>
+              <w:t xml:space="preserve"/>
+            </w:r>
+          </w:p>
+        </w:tc>
+        <w:tc>
+          <w:tcPr>
+            <w:tcBorders>
+              <w:bottom w:val="none" w:sz="0" w:space="0" w:color="000000"/>
+              <w:top w:val="none" w:sz="0" w:space="0" w:color="000000"/>
+              <w:left w:val="none" w:sz="0" w:space="0" w:color="000000"/>
+              <w:right w:val="none" w:sz="0" w:space="0" w:color="000000"/>
+            </w:tcBorders>
+            <w:shd w:val="clear" w:color="auto" w:fill="FFFFFF"/>
+            <w:tcMar>
+              <w:top w:w="0" w:type="dxa"/>
+              <w:bottom w:w="0" w:type="dxa"/>
+              <w:left w:w="0" w:type="dxa"/>
+              <w:right w:w="0" w:type="dxa"/>
+            </w:tcMar>
+            <w:vAlign w:val="center"/>
+          </w:tcPr>
+          <w:p>
+            <w:pPr>
+              <w:pStyle w:val="Normal"/>
+              <w:jc w:val="left"/>
+              <w:pBdr>
+                <w:bottom w:val="none" w:sz="0" w:space="0" w:color="000000"/>
+                <w:top w:val="none" w:sz="0" w:space="0" w:color="000000"/>
+                <w:left w:val="none" w:sz="0" w:space="0" w:color="000000"/>
+                <w:right w:val="none" w:sz="0" w:space="0" w:color="000000"/>
+              </w:pBdr>
+              <w:spacing w:after="100" w:before="100" w:line="240"/>
+              <w:ind w:left="100" w:right="100" w:firstLine="0" w:firstLineChars="0"/>
+              <w:rPr>
+                <w:rFonts w:ascii="Helvetica" w:hAnsi="Helvetica" w:eastAsia="Helvetica" w:cs="Helvetica"/>
+                <w:i w:val="false"/>
+                <w:b w:val="false"/>
+                <w:u w:val="none"/>
+                <w:strike w:val="false"/>
+                <w:sz w:val="22"/>
+                <w:szCs w:val="22"/>
+                <w:color w:val="000000"/>
+              </w:rPr>
+            </w:pPr>
+            <w:r>
+              <w:rPr>
+                <w:rFonts w:ascii="Helvetica" w:hAnsi="Helvetica" w:eastAsia="Helvetica" w:cs="Helvetica"/>
+                <w:i w:val="false"/>
+                <w:b w:val="false"/>
+                <w:u w:val="none"/>
+                <w:strike w:val="false"/>
+                <w:sz w:val="22"/>
+                <w:szCs w:val="22"/>
+                <w:color w:val="000000"/>
+              </w:rPr>
+              <w:t xml:space="preserve"/>
+            </w:r>
+          </w:p>
+        </w:tc>
+        <w:tc>
+          <w:tcPr>
+            <w:tcBorders>
+              <w:bottom w:val="none" w:sz="0" w:space="0" w:color="000000"/>
+              <w:top w:val="none" w:sz="0" w:space="0" w:color="000000"/>
+              <w:left w:val="none" w:sz="0" w:space="0" w:color="000000"/>
+              <w:right w:val="none" w:sz="0" w:space="0" w:color="000000"/>
+            </w:tcBorders>
+            <w:shd w:val="clear" w:color="auto" w:fill="FFFFFF"/>
+            <w:tcMar>
+              <w:top w:w="0" w:type="dxa"/>
+              <w:bottom w:w="0" w:type="dxa"/>
+              <w:left w:w="0" w:type="dxa"/>
+              <w:right w:w="0" w:type="dxa"/>
+            </w:tcMar>
+            <w:vAlign w:val="center"/>
+          </w:tcPr>
+          <w:p>
+            <w:pPr>
+              <w:pStyle w:val="Normal"/>
+              <w:jc w:val="left"/>
+              <w:pBdr>
+                <w:bottom w:val="none" w:sz="0" w:space="0" w:color="000000"/>
+                <w:top w:val="none" w:sz="0" w:space="0" w:color="000000"/>
+                <w:left w:val="none" w:sz="0" w:space="0" w:color="000000"/>
+                <w:right w:val="none" w:sz="0" w:space="0" w:color="000000"/>
+              </w:pBdr>
+              <w:spacing w:after="100" w:before="100" w:line="240"/>
+              <w:ind w:left="100" w:right="100" w:firstLine="0" w:firstLineChars="0"/>
+              <w:rPr>
+                <w:rFonts w:ascii="Helvetica" w:hAnsi="Helvetica" w:eastAsia="Helvetica" w:cs="Helvetica"/>
+                <w:i w:val="false"/>
+                <w:b w:val="false"/>
+                <w:u w:val="none"/>
+                <w:strike w:val="false"/>
+                <w:sz w:val="22"/>
+                <w:szCs w:val="22"/>
+                <w:color w:val="000000"/>
+              </w:rPr>
+            </w:pPr>
+            <w:r>
+              <w:rPr>
+                <w:rFonts w:ascii="Helvetica" w:hAnsi="Helvetica" w:eastAsia="Helvetica" w:cs="Helvetica"/>
+                <w:i w:val="false"/>
+                <w:b w:val="false"/>
+                <w:u w:val="none"/>
+                <w:strike w:val="false"/>
+                <w:sz w:val="22"/>
+                <w:szCs w:val="22"/>
+                <w:color w:val="000000"/>
+              </w:rPr>
+              <w:t xml:space="preserve"/>
+            </w:r>
+          </w:p>
+        </w:tc>
+      </w:tr>
+      <w:tr>
+        <w:trPr>
+          <w:trHeight w:val="608" w:hRule="auto"/>
+        </w:trPr>
+        <w:tc>
+          <w:tcPr>
+            <w:tcBorders>
+              <w:bottom w:val="none" w:sz="0" w:space="0" w:color="000000"/>
+              <w:top w:val="none" w:sz="0" w:space="0" w:color="000000"/>
+              <w:left w:val="none" w:sz="0" w:space="0" w:color="000000"/>
+              <w:right w:val="none" w:sz="0" w:space="0" w:color="000000"/>
+            </w:tcBorders>
+            <w:shd w:val="clear" w:color="auto" w:fill="FFFFFF"/>
+            <w:tcMar>
+              <w:top w:w="0" w:type="dxa"/>
+              <w:bottom w:w="0" w:type="dxa"/>
+              <w:left w:w="0" w:type="dxa"/>
+              <w:right w:w="0" w:type="dxa"/>
+            </w:tcMar>
+            <w:vAlign w:val="center"/>
+          </w:tcPr>
+          <w:p>
+            <w:pPr>
+              <w:pStyle w:val="Normal"/>
+              <w:jc w:val="left"/>
+              <w:pBdr>
+                <w:bottom w:val="none" w:sz="0" w:space="0" w:color="000000"/>
+                <w:top w:val="none" w:sz="0" w:space="0" w:color="000000"/>
+                <w:left w:val="none" w:sz="0" w:space="0" w:color="000000"/>
+                <w:right w:val="none" w:sz="0" w:space="0" w:color="000000"/>
+              </w:pBdr>
+              <w:spacing w:after="100" w:before="100" w:line="240"/>
+              <w:ind w:left="100" w:right="100" w:firstLine="0" w:firstLineChars="0"/>
+              <w:rPr>
+                <w:rFonts w:ascii="Helvetica" w:hAnsi="Helvetica" w:eastAsia="Helvetica" w:cs="Helvetica"/>
+                <w:i w:val="false"/>
+                <w:b w:val="false"/>
+                <w:u w:val="none"/>
+                <w:strike w:val="false"/>
+                <w:sz w:val="22"/>
+                <w:szCs w:val="22"/>
+                <w:color w:val="000000"/>
+              </w:rPr>
+            </w:pPr>
+            <w:r>
+              <w:rPr>
+                <w:rFonts w:ascii="Helvetica" w:hAnsi="Helvetica" w:eastAsia="Helvetica" w:cs="Helvetica"/>
+                <w:i w:val="false"/>
+                <w:b w:val="false"/>
+                <w:u w:val="none"/>
+                <w:strike w:val="false"/>
+                <w:sz w:val="22"/>
+                <w:szCs w:val="22"/>
+                <w:color w:val="000000"/>
+              </w:rPr>
+              <w:t xml:space="preserve">cancerrisk</w:t>
+            </w:r>
+          </w:p>
+        </w:tc>
+        <w:tc>
+          <w:tcPr>
+            <w:tcBorders>
+              <w:bottom w:val="none" w:sz="0" w:space="0" w:color="000000"/>
+              <w:top w:val="none" w:sz="0" w:space="0" w:color="000000"/>
+              <w:left w:val="none" w:sz="0" w:space="0" w:color="000000"/>
+              <w:right w:val="none" w:sz="0" w:space="0" w:color="000000"/>
+            </w:tcBorders>
+            <w:shd w:val="clear" w:color="auto" w:fill="FFFFFF"/>
+            <w:tcMar>
+              <w:top w:w="0" w:type="dxa"/>
+              <w:bottom w:w="0" w:type="dxa"/>
+              <w:left w:w="0" w:type="dxa"/>
+              <w:right w:w="0" w:type="dxa"/>
+            </w:tcMar>
+            <w:vAlign w:val="center"/>
+          </w:tcPr>
+          <w:p>
+            <w:pPr>
+              <w:pStyle w:val="Normal"/>
+              <w:jc w:val="left"/>
+              <w:pBdr>
+                <w:bottom w:val="none" w:sz="0" w:space="0" w:color="000000"/>
+                <w:top w:val="none" w:sz="0" w:space="0" w:color="000000"/>
+                <w:left w:val="none" w:sz="0" w:space="0" w:color="000000"/>
+                <w:right w:val="none" w:sz="0" w:space="0" w:color="000000"/>
+              </w:pBdr>
+              <w:spacing w:after="100" w:before="100" w:line="240"/>
+              <w:ind w:left="100" w:right="100" w:firstLine="0" w:firstLineChars="0"/>
+              <w:rPr>
+                <w:rFonts w:ascii="Helvetica" w:hAnsi="Helvetica" w:eastAsia="Helvetica" w:cs="Helvetica"/>
+                <w:i w:val="false"/>
+                <w:b w:val="false"/>
+                <w:u w:val="none"/>
+                <w:strike w:val="false"/>
+                <w:sz w:val="22"/>
+                <w:szCs w:val="22"/>
+                <w:color w:val="000000"/>
+              </w:rPr>
+            </w:pPr>
+            <w:r>
+              <w:rPr>
+                <w:rFonts w:ascii="Helvetica" w:hAnsi="Helvetica" w:eastAsia="Helvetica" w:cs="Helvetica"/>
+                <w:i w:val="false"/>
+                <w:b w:val="false"/>
+                <w:u w:val="none"/>
+                <w:strike w:val="false"/>
+                <w:sz w:val="22"/>
+                <w:szCs w:val="22"/>
+                <w:color w:val="000000"/>
+              </w:rPr>
+              <w:t xml:space="preserve">-0.144</w:t>
+            </w:r>
+          </w:p>
+        </w:tc>
+        <w:tc>
+          <w:tcPr>
+            <w:tcBorders>
+              <w:bottom w:val="none" w:sz="0" w:space="0" w:color="000000"/>
+              <w:top w:val="none" w:sz="0" w:space="0" w:color="000000"/>
+              <w:left w:val="none" w:sz="0" w:space="0" w:color="000000"/>
+              <w:right w:val="none" w:sz="0" w:space="0" w:color="000000"/>
+            </w:tcBorders>
+            <w:shd w:val="clear" w:color="auto" w:fill="FFFFFF"/>
+            <w:tcMar>
+              <w:top w:w="0" w:type="dxa"/>
+              <w:bottom w:w="0" w:type="dxa"/>
+              <w:left w:w="0" w:type="dxa"/>
+              <w:right w:w="0" w:type="dxa"/>
+            </w:tcMar>
+            <w:vAlign w:val="center"/>
+          </w:tcPr>
+          <w:p>
+            <w:pPr>
+              <w:pStyle w:val="Normal"/>
+              <w:jc w:val="left"/>
+              <w:pBdr>
+                <w:bottom w:val="none" w:sz="0" w:space="0" w:color="000000"/>
+                <w:top w:val="none" w:sz="0" w:space="0" w:color="000000"/>
+                <w:left w:val="none" w:sz="0" w:space="0" w:color="000000"/>
+                <w:right w:val="none" w:sz="0" w:space="0" w:color="000000"/>
+              </w:pBdr>
+              <w:spacing w:after="100" w:before="100" w:line="240"/>
+              <w:ind w:left="100" w:right="100" w:firstLine="0" w:firstLineChars="0"/>
+              <w:rPr>
+                <w:rFonts w:ascii="Helvetica" w:hAnsi="Helvetica" w:eastAsia="Helvetica" w:cs="Helvetica"/>
+                <w:i w:val="false"/>
+                <w:b w:val="false"/>
+                <w:u w:val="none"/>
+                <w:strike w:val="false"/>
+                <w:sz w:val="22"/>
+                <w:szCs w:val="22"/>
+                <w:color w:val="000000"/>
+              </w:rPr>
+            </w:pPr>
+            <w:r>
+              <w:rPr>
+                <w:rFonts w:ascii="Helvetica" w:hAnsi="Helvetica" w:eastAsia="Helvetica" w:cs="Helvetica"/>
+                <w:i w:val="false"/>
+                <w:b w:val="false"/>
+                <w:u w:val="none"/>
+                <w:strike w:val="false"/>
+                <w:sz w:val="22"/>
+                <w:szCs w:val="22"/>
+                <w:color w:val="000000"/>
+              </w:rPr>
+              <w:t xml:space="preserve">-0.037</w:t>
+            </w:r>
+          </w:p>
+        </w:tc>
+        <w:tc>
+          <w:tcPr>
+            <w:tcBorders>
+              <w:bottom w:val="none" w:sz="0" w:space="0" w:color="000000"/>
+              <w:top w:val="none" w:sz="0" w:space="0" w:color="000000"/>
+              <w:left w:val="none" w:sz="0" w:space="0" w:color="000000"/>
+              <w:right w:val="none" w:sz="0" w:space="0" w:color="000000"/>
+            </w:tcBorders>
+            <w:shd w:val="clear" w:color="auto" w:fill="FFFFFF"/>
+            <w:tcMar>
+              <w:top w:w="0" w:type="dxa"/>
+              <w:bottom w:w="0" w:type="dxa"/>
+              <w:left w:w="0" w:type="dxa"/>
+              <w:right w:w="0" w:type="dxa"/>
+            </w:tcMar>
+            <w:vAlign w:val="center"/>
+          </w:tcPr>
+          <w:p>
+            <w:pPr>
+              <w:pStyle w:val="Normal"/>
+              <w:jc w:val="left"/>
+              <w:pBdr>
+                <w:bottom w:val="none" w:sz="0" w:space="0" w:color="000000"/>
+                <w:top w:val="none" w:sz="0" w:space="0" w:color="000000"/>
+                <w:left w:val="none" w:sz="0" w:space="0" w:color="000000"/>
+                <w:right w:val="none" w:sz="0" w:space="0" w:color="000000"/>
+              </w:pBdr>
+              <w:spacing w:after="100" w:before="100" w:line="240"/>
+              <w:ind w:left="100" w:right="100" w:firstLine="0" w:firstLineChars="0"/>
+              <w:rPr>
+                <w:rFonts w:ascii="Helvetica" w:hAnsi="Helvetica" w:eastAsia="Helvetica" w:cs="Helvetica"/>
+                <w:i w:val="false"/>
+                <w:b w:val="false"/>
+                <w:u w:val="none"/>
+                <w:strike w:val="false"/>
+                <w:sz w:val="22"/>
+                <w:szCs w:val="22"/>
+                <w:color w:val="000000"/>
+              </w:rPr>
+            </w:pPr>
+            <w:r>
+              <w:rPr>
+                <w:rFonts w:ascii="Helvetica" w:hAnsi="Helvetica" w:eastAsia="Helvetica" w:cs="Helvetica"/>
+                <w:i w:val="false"/>
+                <w:b w:val="false"/>
+                <w:u w:val="none"/>
+                <w:strike w:val="false"/>
+                <w:sz w:val="22"/>
+                <w:szCs w:val="22"/>
+                <w:color w:val="000000"/>
+              </w:rPr>
+              <w:t xml:space="preserve">0.062</w:t>
+            </w:r>
+          </w:p>
+        </w:tc>
+        <w:tc>
+          <w:tcPr>
+            <w:tcBorders>
+              <w:bottom w:val="none" w:sz="0" w:space="0" w:color="000000"/>
+              <w:top w:val="none" w:sz="0" w:space="0" w:color="000000"/>
+              <w:left w:val="none" w:sz="0" w:space="0" w:color="000000"/>
+              <w:right w:val="none" w:sz="0" w:space="0" w:color="000000"/>
+            </w:tcBorders>
+            <w:shd w:val="clear" w:color="auto" w:fill="FFFFFF"/>
+            <w:tcMar>
+              <w:top w:w="0" w:type="dxa"/>
+              <w:bottom w:w="0" w:type="dxa"/>
+              <w:left w:w="0" w:type="dxa"/>
+              <w:right w:w="0" w:type="dxa"/>
+            </w:tcMar>
+            <w:vAlign w:val="center"/>
+          </w:tcPr>
+          <w:p>
+            <w:pPr>
+              <w:pStyle w:val="Normal"/>
+              <w:jc w:val="left"/>
+              <w:pBdr>
+                <w:bottom w:val="none" w:sz="0" w:space="0" w:color="000000"/>
+                <w:top w:val="none" w:sz="0" w:space="0" w:color="000000"/>
+                <w:left w:val="none" w:sz="0" w:space="0" w:color="000000"/>
+                <w:right w:val="none" w:sz="0" w:space="0" w:color="000000"/>
+              </w:pBdr>
+              <w:spacing w:after="100" w:before="100" w:line="240"/>
+              <w:ind w:left="100" w:right="100" w:firstLine="0" w:firstLineChars="0"/>
+              <w:rPr>
+                <w:rFonts w:ascii="Helvetica" w:hAnsi="Helvetica" w:eastAsia="Helvetica" w:cs="Helvetica"/>
+                <w:i w:val="false"/>
+                <w:b w:val="false"/>
+                <w:u w:val="none"/>
+                <w:strike w:val="false"/>
+                <w:sz w:val="22"/>
+                <w:szCs w:val="22"/>
+                <w:color w:val="000000"/>
+              </w:rPr>
+            </w:pPr>
+            <w:r>
+              <w:rPr>
+                <w:rFonts w:ascii="Helvetica" w:hAnsi="Helvetica" w:eastAsia="Helvetica" w:cs="Helvetica"/>
+                <w:i w:val="false"/>
+                <w:b w:val="false"/>
+                <w:u w:val="none"/>
+                <w:strike w:val="false"/>
+                <w:sz w:val="22"/>
+                <w:szCs w:val="22"/>
+                <w:color w:val="000000"/>
+              </w:rPr>
+              <w:t xml:space="preserve">0.171</w:t>
+            </w:r>
+          </w:p>
+        </w:tc>
+        <w:tc>
+          <w:tcPr>
+            <w:tcBorders>
+              <w:bottom w:val="none" w:sz="0" w:space="0" w:color="000000"/>
+              <w:top w:val="none" w:sz="0" w:space="0" w:color="000000"/>
+              <w:left w:val="none" w:sz="0" w:space="0" w:color="000000"/>
+              <w:right w:val="none" w:sz="0" w:space="0" w:color="000000"/>
+            </w:tcBorders>
+            <w:shd w:val="clear" w:color="auto" w:fill="FFFFFF"/>
+            <w:tcMar>
+              <w:top w:w="0" w:type="dxa"/>
+              <w:bottom w:w="0" w:type="dxa"/>
+              <w:left w:w="0" w:type="dxa"/>
+              <w:right w:w="0" w:type="dxa"/>
+            </w:tcMar>
+            <w:vAlign w:val="center"/>
+          </w:tcPr>
+          <w:p>
+            <w:pPr>
+              <w:pStyle w:val="Normal"/>
+              <w:jc w:val="left"/>
+              <w:pBdr>
+                <w:bottom w:val="none" w:sz="0" w:space="0" w:color="000000"/>
+                <w:top w:val="none" w:sz="0" w:space="0" w:color="000000"/>
+                <w:left w:val="none" w:sz="0" w:space="0" w:color="000000"/>
+                <w:right w:val="none" w:sz="0" w:space="0" w:color="000000"/>
+              </w:pBdr>
+              <w:spacing w:after="100" w:before="100" w:line="240"/>
+              <w:ind w:left="100" w:right="100" w:firstLine="0" w:firstLineChars="0"/>
+              <w:rPr>
+                <w:rFonts w:ascii="Helvetica" w:hAnsi="Helvetica" w:eastAsia="Helvetica" w:cs="Helvetica"/>
+                <w:i w:val="false"/>
+                <w:b w:val="false"/>
+                <w:u w:val="none"/>
+                <w:strike w:val="false"/>
+                <w:sz w:val="22"/>
+                <w:szCs w:val="22"/>
+                <w:color w:val="000000"/>
+              </w:rPr>
+            </w:pPr>
+            <w:r>
+              <w:rPr>
+                <w:rFonts w:ascii="Helvetica" w:hAnsi="Helvetica" w:eastAsia="Helvetica" w:cs="Helvetica"/>
+                <w:i w:val="false"/>
+                <w:b w:val="false"/>
+                <w:u w:val="none"/>
+                <w:strike w:val="false"/>
+                <w:sz w:val="22"/>
+                <w:szCs w:val="22"/>
+                <w:color w:val="000000"/>
+              </w:rPr>
+              <w:t xml:space="preserve"/>
+            </w:r>
+          </w:p>
+        </w:tc>
+        <w:tc>
+          <w:tcPr>
+            <w:tcBorders>
+              <w:bottom w:val="none" w:sz="0" w:space="0" w:color="000000"/>
+              <w:top w:val="none" w:sz="0" w:space="0" w:color="000000"/>
+              <w:left w:val="none" w:sz="0" w:space="0" w:color="000000"/>
+              <w:right w:val="none" w:sz="0" w:space="0" w:color="000000"/>
+            </w:tcBorders>
+            <w:shd w:val="clear" w:color="auto" w:fill="FFFFFF"/>
+            <w:tcMar>
+              <w:top w:w="0" w:type="dxa"/>
+              <w:bottom w:w="0" w:type="dxa"/>
+              <w:left w:w="0" w:type="dxa"/>
+              <w:right w:w="0" w:type="dxa"/>
+            </w:tcMar>
+            <w:vAlign w:val="center"/>
+          </w:tcPr>
+          <w:p>
+            <w:pPr>
+              <w:pStyle w:val="Normal"/>
+              <w:jc w:val="left"/>
+              <w:pBdr>
+                <w:bottom w:val="none" w:sz="0" w:space="0" w:color="000000"/>
+                <w:top w:val="none" w:sz="0" w:space="0" w:color="000000"/>
+                <w:left w:val="none" w:sz="0" w:space="0" w:color="000000"/>
+                <w:right w:val="none" w:sz="0" w:space="0" w:color="000000"/>
+              </w:pBdr>
+              <w:spacing w:after="100" w:before="100" w:line="240"/>
+              <w:ind w:left="100" w:right="100" w:firstLine="0" w:firstLineChars="0"/>
+              <w:rPr>
+                <w:rFonts w:ascii="Helvetica" w:hAnsi="Helvetica" w:eastAsia="Helvetica" w:cs="Helvetica"/>
+                <w:i w:val="false"/>
+                <w:b w:val="false"/>
+                <w:u w:val="none"/>
+                <w:strike w:val="false"/>
+                <w:sz w:val="22"/>
+                <w:szCs w:val="22"/>
+                <w:color w:val="000000"/>
+              </w:rPr>
+            </w:pPr>
+            <w:r>
+              <w:rPr>
+                <w:rFonts w:ascii="Helvetica" w:hAnsi="Helvetica" w:eastAsia="Helvetica" w:cs="Helvetica"/>
+                <w:i w:val="false"/>
+                <w:b w:val="false"/>
+                <w:u w:val="none"/>
+                <w:strike w:val="false"/>
+                <w:sz w:val="22"/>
+                <w:szCs w:val="22"/>
+                <w:color w:val="000000"/>
+              </w:rPr>
+              <w:t xml:space="preserve"/>
+            </w:r>
+          </w:p>
+        </w:tc>
+      </w:tr>
+      <w:tr>
+        <w:trPr>
+          <w:trHeight w:val="623" w:hRule="auto"/>
+        </w:trPr>
+        <w:tc>
+          <w:tcPr>
+            <w:tcBorders>
+              <w:bottom w:val="single" w:sz="12" w:space="0" w:color="666666"/>
+              <w:top w:val="none" w:sz="0" w:space="0" w:color="000000"/>
+              <w:left w:val="none" w:sz="0" w:space="0" w:color="000000"/>
+              <w:right w:val="none" w:sz="0" w:space="0" w:color="000000"/>
+            </w:tcBorders>
+            <w:shd w:val="clear" w:color="auto" w:fill="FFFFFF"/>
+            <w:tcMar>
+              <w:top w:w="0" w:type="dxa"/>
+              <w:bottom w:w="0" w:type="dxa"/>
+              <w:left w:w="0" w:type="dxa"/>
+              <w:right w:w="0" w:type="dxa"/>
+            </w:tcMar>
+            <w:vAlign w:val="center"/>
+          </w:tcPr>
+          <w:p>
+            <w:pPr>
+              <w:pStyle w:val="Normal"/>
+              <w:jc w:val="left"/>
+              <w:pBdr>
+                <w:bottom w:val="none" w:sz="0" w:space="0" w:color="000000"/>
+                <w:top w:val="none" w:sz="0" w:space="0" w:color="000000"/>
+                <w:left w:val="none" w:sz="0" w:space="0" w:color="000000"/>
+                <w:right w:val="none" w:sz="0" w:space="0" w:color="000000"/>
+              </w:pBdr>
+              <w:spacing w:after="100" w:before="100" w:line="240"/>
+              <w:ind w:left="100" w:right="100" w:firstLine="0" w:firstLineChars="0"/>
+              <w:rPr>
+                <w:rFonts w:ascii="Helvetica" w:hAnsi="Helvetica" w:eastAsia="Helvetica" w:cs="Helvetica"/>
+                <w:i w:val="false"/>
+                <w:b w:val="false"/>
+                <w:u w:val="none"/>
+                <w:strike w:val="false"/>
+                <w:sz w:val="22"/>
+                <w:szCs w:val="22"/>
+                <w:color w:val="000000"/>
+              </w:rPr>
+            </w:pPr>
+            <w:r>
+              <w:rPr>
+                <w:rFonts w:ascii="Helvetica" w:hAnsi="Helvetica" w:eastAsia="Helvetica" w:cs="Helvetica"/>
+                <w:i w:val="false"/>
+                <w:b w:val="false"/>
+                <w:u w:val="none"/>
+                <w:strike w:val="false"/>
+                <w:sz w:val="22"/>
+                <w:szCs w:val="22"/>
+                <w:color w:val="000000"/>
+              </w:rPr>
+              <w:t xml:space="preserve">efficacy</w:t>
+            </w:r>
+          </w:p>
+        </w:tc>
+        <w:tc>
+          <w:tcPr>
+            <w:tcBorders>
+              <w:bottom w:val="single" w:sz="12" w:space="0" w:color="666666"/>
+              <w:top w:val="none" w:sz="0" w:space="0" w:color="000000"/>
+              <w:left w:val="none" w:sz="0" w:space="0" w:color="000000"/>
+              <w:right w:val="none" w:sz="0" w:space="0" w:color="000000"/>
+            </w:tcBorders>
+            <w:shd w:val="clear" w:color="auto" w:fill="FFFFFF"/>
+            <w:tcMar>
+              <w:top w:w="0" w:type="dxa"/>
+              <w:bottom w:w="0" w:type="dxa"/>
+              <w:left w:w="0" w:type="dxa"/>
+              <w:right w:w="0" w:type="dxa"/>
+            </w:tcMar>
+            <w:vAlign w:val="center"/>
+          </w:tcPr>
+          <w:p>
+            <w:pPr>
+              <w:pStyle w:val="Normal"/>
+              <w:jc w:val="left"/>
+              <w:pBdr>
+                <w:bottom w:val="none" w:sz="0" w:space="0" w:color="000000"/>
+                <w:top w:val="none" w:sz="0" w:space="0" w:color="000000"/>
+                <w:left w:val="none" w:sz="0" w:space="0" w:color="000000"/>
+                <w:right w:val="none" w:sz="0" w:space="0" w:color="000000"/>
+              </w:pBdr>
+              <w:spacing w:after="100" w:before="100" w:line="240"/>
+              <w:ind w:left="100" w:right="100" w:firstLine="0" w:firstLineChars="0"/>
+              <w:rPr>
+                <w:rFonts w:ascii="Helvetica" w:hAnsi="Helvetica" w:eastAsia="Helvetica" w:cs="Helvetica"/>
+                <w:i w:val="false"/>
+                <w:b w:val="false"/>
+                <w:u w:val="none"/>
+                <w:strike w:val="false"/>
+                <w:sz w:val="22"/>
+                <w:szCs w:val="22"/>
+                <w:color w:val="000000"/>
+              </w:rPr>
+            </w:pPr>
+            <w:r>
+              <w:rPr>
+                <w:rFonts w:ascii="Helvetica" w:hAnsi="Helvetica" w:eastAsia="Helvetica" w:cs="Helvetica"/>
+                <w:i w:val="false"/>
+                <w:b w:val="false"/>
+                <w:u w:val="none"/>
+                <w:strike w:val="false"/>
+                <w:sz w:val="22"/>
+                <w:szCs w:val="22"/>
+                <w:color w:val="000000"/>
+              </w:rPr>
+              <w:t xml:space="preserve">-0.021</w:t>
+            </w:r>
+          </w:p>
+        </w:tc>
+        <w:tc>
+          <w:tcPr>
+            <w:tcBorders>
+              <w:bottom w:val="single" w:sz="12" w:space="0" w:color="666666"/>
+              <w:top w:val="none" w:sz="0" w:space="0" w:color="000000"/>
+              <w:left w:val="none" w:sz="0" w:space="0" w:color="000000"/>
+              <w:right w:val="none" w:sz="0" w:space="0" w:color="000000"/>
+            </w:tcBorders>
+            <w:shd w:val="clear" w:color="auto" w:fill="FFFFFF"/>
+            <w:tcMar>
+              <w:top w:w="0" w:type="dxa"/>
+              <w:bottom w:w="0" w:type="dxa"/>
+              <w:left w:w="0" w:type="dxa"/>
+              <w:right w:w="0" w:type="dxa"/>
+            </w:tcMar>
+            <w:vAlign w:val="center"/>
+          </w:tcPr>
+          <w:p>
+            <w:pPr>
+              <w:pStyle w:val="Normal"/>
+              <w:jc w:val="left"/>
+              <w:pBdr>
+                <w:bottom w:val="none" w:sz="0" w:space="0" w:color="000000"/>
+                <w:top w:val="none" w:sz="0" w:space="0" w:color="000000"/>
+                <w:left w:val="none" w:sz="0" w:space="0" w:color="000000"/>
+                <w:right w:val="none" w:sz="0" w:space="0" w:color="000000"/>
+              </w:pBdr>
+              <w:spacing w:after="100" w:before="100" w:line="240"/>
+              <w:ind w:left="100" w:right="100" w:firstLine="0" w:firstLineChars="0"/>
+              <w:rPr>
+                <w:rFonts w:ascii="Helvetica" w:hAnsi="Helvetica" w:eastAsia="Helvetica" w:cs="Helvetica"/>
+                <w:i w:val="false"/>
+                <w:b w:val="false"/>
+                <w:u w:val="none"/>
+                <w:strike w:val="false"/>
+                <w:sz w:val="22"/>
+                <w:szCs w:val="22"/>
+                <w:color w:val="000000"/>
+              </w:rPr>
+            </w:pPr>
+            <w:r>
+              <w:rPr>
+                <w:rFonts w:ascii="Helvetica" w:hAnsi="Helvetica" w:eastAsia="Helvetica" w:cs="Helvetica"/>
+                <w:i w:val="false"/>
+                <w:b w:val="false"/>
+                <w:u w:val="none"/>
+                <w:strike w:val="false"/>
+                <w:sz w:val="22"/>
+                <w:szCs w:val="22"/>
+                <w:color w:val="000000"/>
+              </w:rPr>
+              <w:t xml:space="preserve">-0.034</w:t>
+            </w:r>
+          </w:p>
+        </w:tc>
+        <w:tc>
+          <w:tcPr>
+            <w:tcBorders>
+              <w:bottom w:val="single" w:sz="12" w:space="0" w:color="666666"/>
+              <w:top w:val="none" w:sz="0" w:space="0" w:color="000000"/>
+              <w:left w:val="none" w:sz="0" w:space="0" w:color="000000"/>
+              <w:right w:val="none" w:sz="0" w:space="0" w:color="000000"/>
+            </w:tcBorders>
+            <w:shd w:val="clear" w:color="auto" w:fill="FFFFFF"/>
+            <w:tcMar>
+              <w:top w:w="0" w:type="dxa"/>
+              <w:bottom w:w="0" w:type="dxa"/>
+              <w:left w:w="0" w:type="dxa"/>
+              <w:right w:w="0" w:type="dxa"/>
+            </w:tcMar>
+            <w:vAlign w:val="center"/>
+          </w:tcPr>
+          <w:p>
+            <w:pPr>
+              <w:pStyle w:val="Normal"/>
+              <w:jc w:val="left"/>
+              <w:pBdr>
+                <w:bottom w:val="none" w:sz="0" w:space="0" w:color="000000"/>
+                <w:top w:val="none" w:sz="0" w:space="0" w:color="000000"/>
+                <w:left w:val="none" w:sz="0" w:space="0" w:color="000000"/>
+                <w:right w:val="none" w:sz="0" w:space="0" w:color="000000"/>
+              </w:pBdr>
+              <w:spacing w:after="100" w:before="100" w:line="240"/>
+              <w:ind w:left="100" w:right="100" w:firstLine="0" w:firstLineChars="0"/>
+              <w:rPr>
+                <w:rFonts w:ascii="Helvetica" w:hAnsi="Helvetica" w:eastAsia="Helvetica" w:cs="Helvetica"/>
+                <w:i w:val="false"/>
+                <w:b w:val="false"/>
+                <w:u w:val="none"/>
+                <w:strike w:val="false"/>
+                <w:sz w:val="22"/>
+                <w:szCs w:val="22"/>
+                <w:color w:val="000000"/>
+              </w:rPr>
+            </w:pPr>
+            <w:r>
+              <w:rPr>
+                <w:rFonts w:ascii="Helvetica" w:hAnsi="Helvetica" w:eastAsia="Helvetica" w:cs="Helvetica"/>
+                <w:i w:val="false"/>
+                <w:b w:val="false"/>
+                <w:u w:val="none"/>
+                <w:strike w:val="false"/>
+                <w:sz w:val="22"/>
+                <w:szCs w:val="22"/>
+                <w:color w:val="000000"/>
+              </w:rPr>
+              <w:t xml:space="preserve">-0.050</w:t>
+            </w:r>
+          </w:p>
+        </w:tc>
+        <w:tc>
+          <w:tcPr>
+            <w:tcBorders>
+              <w:bottom w:val="single" w:sz="12" w:space="0" w:color="666666"/>
+              <w:top w:val="none" w:sz="0" w:space="0" w:color="000000"/>
+              <w:left w:val="none" w:sz="0" w:space="0" w:color="000000"/>
+              <w:right w:val="none" w:sz="0" w:space="0" w:color="000000"/>
+            </w:tcBorders>
+            <w:shd w:val="clear" w:color="auto" w:fill="FFFFFF"/>
+            <w:tcMar>
+              <w:top w:w="0" w:type="dxa"/>
+              <w:bottom w:w="0" w:type="dxa"/>
+              <w:left w:w="0" w:type="dxa"/>
+              <w:right w:w="0" w:type="dxa"/>
+            </w:tcMar>
+            <w:vAlign w:val="center"/>
+          </w:tcPr>
+          <w:p>
+            <w:pPr>
+              <w:pStyle w:val="Normal"/>
+              <w:jc w:val="left"/>
+              <w:pBdr>
+                <w:bottom w:val="none" w:sz="0" w:space="0" w:color="000000"/>
+                <w:top w:val="none" w:sz="0" w:space="0" w:color="000000"/>
+                <w:left w:val="none" w:sz="0" w:space="0" w:color="000000"/>
+                <w:right w:val="none" w:sz="0" w:space="0" w:color="000000"/>
+              </w:pBdr>
+              <w:spacing w:after="100" w:before="100" w:line="240"/>
+              <w:ind w:left="100" w:right="100" w:firstLine="0" w:firstLineChars="0"/>
+              <w:rPr>
+                <w:rFonts w:ascii="Helvetica" w:hAnsi="Helvetica" w:eastAsia="Helvetica" w:cs="Helvetica"/>
+                <w:i w:val="false"/>
+                <w:b w:val="false"/>
+                <w:u w:val="none"/>
+                <w:strike w:val="false"/>
+                <w:sz w:val="22"/>
+                <w:szCs w:val="22"/>
+                <w:color w:val="000000"/>
+              </w:rPr>
+            </w:pPr>
+            <w:r>
+              <w:rPr>
+                <w:rFonts w:ascii="Helvetica" w:hAnsi="Helvetica" w:eastAsia="Helvetica" w:cs="Helvetica"/>
+                <w:i w:val="false"/>
+                <w:b w:val="false"/>
+                <w:u w:val="none"/>
+                <w:strike w:val="false"/>
+                <w:sz w:val="22"/>
+                <w:szCs w:val="22"/>
+                <w:color w:val="000000"/>
+              </w:rPr>
+              <w:t xml:space="preserve">-0.035</w:t>
+            </w:r>
+          </w:p>
+        </w:tc>
+        <w:tc>
+          <w:tcPr>
+            <w:tcBorders>
+              <w:bottom w:val="single" w:sz="12" w:space="0" w:color="666666"/>
+              <w:top w:val="none" w:sz="0" w:space="0" w:color="000000"/>
+              <w:left w:val="none" w:sz="0" w:space="0" w:color="000000"/>
+              <w:right w:val="none" w:sz="0" w:space="0" w:color="000000"/>
+            </w:tcBorders>
+            <w:shd w:val="clear" w:color="auto" w:fill="FFFFFF"/>
+            <w:tcMar>
+              <w:top w:w="0" w:type="dxa"/>
+              <w:bottom w:w="0" w:type="dxa"/>
+              <w:left w:w="0" w:type="dxa"/>
+              <w:right w:w="0" w:type="dxa"/>
+            </w:tcMar>
+            <w:vAlign w:val="center"/>
+          </w:tcPr>
+          <w:p>
+            <w:pPr>
+              <w:pStyle w:val="Normal"/>
+              <w:jc w:val="left"/>
+              <w:pBdr>
+                <w:bottom w:val="none" w:sz="0" w:space="0" w:color="000000"/>
+                <w:top w:val="none" w:sz="0" w:space="0" w:color="000000"/>
+                <w:left w:val="none" w:sz="0" w:space="0" w:color="000000"/>
+                <w:right w:val="none" w:sz="0" w:space="0" w:color="000000"/>
+              </w:pBdr>
+              <w:spacing w:after="100" w:before="100" w:line="240"/>
+              <w:ind w:left="100" w:right="100" w:firstLine="0" w:firstLineChars="0"/>
+              <w:rPr>
+                <w:rFonts w:ascii="Helvetica" w:hAnsi="Helvetica" w:eastAsia="Helvetica" w:cs="Helvetica"/>
+                <w:i w:val="false"/>
+                <w:b w:val="false"/>
+                <w:u w:val="none"/>
+                <w:strike w:val="false"/>
+                <w:sz w:val="22"/>
+                <w:szCs w:val="22"/>
+                <w:color w:val="000000"/>
+              </w:rPr>
+            </w:pPr>
+            <w:r>
+              <w:rPr>
+                <w:rFonts w:ascii="Helvetica" w:hAnsi="Helvetica" w:eastAsia="Helvetica" w:cs="Helvetica"/>
+                <w:i w:val="false"/>
+                <w:b w:val="false"/>
+                <w:u w:val="none"/>
+                <w:strike w:val="false"/>
+                <w:sz w:val="22"/>
+                <w:szCs w:val="22"/>
+                <w:color w:val="000000"/>
+              </w:rPr>
+              <w:t xml:space="preserve">-0.120</w:t>
+            </w:r>
+          </w:p>
+        </w:tc>
+        <w:tc>
+          <w:tcPr>
+            <w:tcBorders>
+              <w:bottom w:val="single" w:sz="12" w:space="0" w:color="666666"/>
+              <w:top w:val="none" w:sz="0" w:space="0" w:color="000000"/>
+              <w:left w:val="none" w:sz="0" w:space="0" w:color="000000"/>
+              <w:right w:val="none" w:sz="0" w:space="0" w:color="000000"/>
+            </w:tcBorders>
+            <w:shd w:val="clear" w:color="auto" w:fill="FFFFFF"/>
+            <w:tcMar>
+              <w:top w:w="0" w:type="dxa"/>
+              <w:bottom w:w="0" w:type="dxa"/>
+              <w:left w:w="0" w:type="dxa"/>
+              <w:right w:w="0" w:type="dxa"/>
+            </w:tcMar>
+            <w:vAlign w:val="center"/>
+          </w:tcPr>
+          <w:p>
+            <w:pPr>
+              <w:pStyle w:val="Normal"/>
+              <w:jc w:val="left"/>
+              <w:pBdr>
+                <w:bottom w:val="none" w:sz="0" w:space="0" w:color="000000"/>
+                <w:top w:val="none" w:sz="0" w:space="0" w:color="000000"/>
+                <w:left w:val="none" w:sz="0" w:space="0" w:color="000000"/>
+                <w:right w:val="none" w:sz="0" w:space="0" w:color="000000"/>
+              </w:pBdr>
+              <w:spacing w:after="100" w:before="100" w:line="240"/>
+              <w:ind w:left="100" w:right="100" w:firstLine="0" w:firstLineChars="0"/>
+              <w:rPr>
+                <w:rFonts w:ascii="Helvetica" w:hAnsi="Helvetica" w:eastAsia="Helvetica" w:cs="Helvetica"/>
+                <w:i w:val="false"/>
+                <w:b w:val="false"/>
+                <w:u w:val="none"/>
+                <w:strike w:val="false"/>
+                <w:sz w:val="22"/>
+                <w:szCs w:val="22"/>
+                <w:color w:val="000000"/>
+              </w:rPr>
+            </w:pPr>
+            <w:r>
+              <w:rPr>
+                <w:rFonts w:ascii="Helvetica" w:hAnsi="Helvetica" w:eastAsia="Helvetica" w:cs="Helvetica"/>
+                <w:i w:val="false"/>
+                <w:b w:val="false"/>
+                <w:u w:val="none"/>
+                <w:strike w:val="false"/>
+                <w:sz w:val="22"/>
+                <w:szCs w:val="22"/>
+                <w:color w:val="000000"/>
+              </w:rPr>
+              <w:t xml:space="preserve"/>
             </w:r>
           </w:p>
         </w:tc>

</xml_diff>